<commit_message>
Shorten CasePilot clinician questionnaire
</commit_message>
<xml_diff>
--- a/research/CasePilot_Clinician_Questionnaire.docx
+++ b/research/CasePilot_Clinician_Questionnaire.docx
@@ -4,7 +4,7 @@
   <w:body>
     <w:p>
       <w:pPr>
-        <w:spacing w:before="0" w:after="40"/>
+        <w:spacing w:after="40"/>
       </w:pPr>
       <w:r>
         <w:rPr>
@@ -18,8 +18,7 @@
     </w:p>
     <w:p>
       <w:pPr>
-        <w:keepNext/>
-        <w:spacing w:before="0" w:after="80"/>
+        <w:spacing w:after="80"/>
       </w:pPr>
       <w:r>
         <w:rPr>
@@ -33,8 +32,7 @@
     </w:p>
     <w:p>
       <w:pPr>
-        <w:keepNext/>
-        <w:spacing w:before="0" w:after="280"/>
+        <w:spacing w:after="280"/>
       </w:pPr>
       <w:r>
         <w:rPr>
@@ -42,7 +40,7 @@
           <w:color w:val="5D6A73"/>
           <w:sz w:val="25"/>
         </w:rPr>
-        <w:t>How school-based mental-health professionals manage case context, follow-through, meetings, interventions, and referrals</w:t>
+        <w:t>Help us focus CasePilot on the work that matters most.</w:t>
       </w:r>
     </w:p>
     <w:tbl>
@@ -52,12 +50,12 @@
         <w:tblLook w:firstColumn="1" w:firstRow="1" w:lastColumn="0" w:lastRow="0" w:noHBand="0" w:noVBand="1" w:val="04A0"/>
         <w:tblInd w:w="120" w:type="dxa"/>
         <w:tblBorders>
-          <w:top w:val="single" w:sz="5" w:space="0" w:color="B8CAD8"/>
-          <w:left w:val="single" w:sz="5" w:space="0" w:color="B8CAD8"/>
-          <w:bottom w:val="single" w:sz="5" w:space="0" w:color="B8CAD8"/>
-          <w:right w:val="single" w:sz="5" w:space="0" w:color="B8CAD8"/>
-          <w:insideH w:val="single" w:sz="5" w:space="0" w:color="B8CAD8"/>
-          <w:insideV w:val="single" w:sz="5" w:space="0" w:color="B8CAD8"/>
+          <w:top w:val="single" w:sz="5" w:space="0" w:color="C9D5DF"/>
+          <w:left w:val="single" w:sz="5" w:space="0" w:color="C9D5DF"/>
+          <w:bottom w:val="single" w:sz="5" w:space="0" w:color="C9D5DF"/>
+          <w:right w:val="single" w:sz="5" w:space="0" w:color="C9D5DF"/>
+          <w:insideH w:val="single" w:sz="5" w:space="0" w:color="C9D5DF"/>
+          <w:insideV w:val="single" w:sz="5" w:space="0" w:color="C9D5DF"/>
         </w:tblBorders>
       </w:tblPr>
       <w:tblGrid>
@@ -80,7 +78,7 @@
           </w:tcPr>
           <w:p>
             <w:pPr>
-              <w:spacing w:before="20" w:after="20"/>
+              <w:spacing w:after="20"/>
               <w:jc w:val="center"/>
             </w:pPr>
             <w:r>
@@ -90,12 +88,12 @@
                 <w:color w:val="17324D"/>
                 <w:sz w:val="21"/>
               </w:rPr>
-              <w:t>10–15 minutes</w:t>
+              <w:t>5 minutes</w:t>
             </w:r>
           </w:p>
           <w:p>
             <w:pPr>
-              <w:spacing w:before="0" w:after="0"/>
+              <w:spacing w:after="0"/>
               <w:jc w:val="center"/>
             </w:pPr>
             <w:r>
@@ -104,7 +102,7 @@
                 <w:color w:val="5D6A73"/>
                 <w:sz w:val="17"/>
               </w:rPr>
-              <w:t>Estimated time</w:t>
+              <w:t>Completion time</w:t>
             </w:r>
           </w:p>
         </w:tc>
@@ -122,7 +120,7 @@
           </w:tcPr>
           <w:p>
             <w:pPr>
-              <w:spacing w:before="20" w:after="20"/>
+              <w:spacing w:after="20"/>
               <w:jc w:val="center"/>
             </w:pPr>
             <w:r>
@@ -132,12 +130,12 @@
                 <w:color w:val="17324D"/>
                 <w:sz w:val="21"/>
               </w:rPr>
-              <w:t>School clinicians</w:t>
+              <w:t>10 questions</w:t>
             </w:r>
           </w:p>
           <w:p>
             <w:pPr>
-              <w:spacing w:before="0" w:after="0"/>
+              <w:spacing w:after="0"/>
               <w:jc w:val="center"/>
             </w:pPr>
             <w:r>
@@ -146,7 +144,7 @@
                 <w:color w:val="5D6A73"/>
                 <w:sz w:val="17"/>
               </w:rPr>
-              <w:t>Intended audience</w:t>
+              <w:t>Highest-impact only</w:t>
             </w:r>
           </w:p>
         </w:tc>
@@ -164,7 +162,7 @@
           </w:tcPr>
           <w:p>
             <w:pPr>
-              <w:spacing w:before="20" w:after="20"/>
+              <w:spacing w:after="20"/>
               <w:jc w:val="center"/>
             </w:pPr>
             <w:r>
@@ -174,12 +172,12 @@
                 <w:color w:val="17324D"/>
                 <w:sz w:val="21"/>
               </w:rPr>
-              <w:t>No student PII</w:t>
+              <w:t>No student details</w:t>
             </w:r>
           </w:p>
           <w:p>
             <w:pPr>
-              <w:spacing w:before="0" w:after="0"/>
+              <w:spacing w:after="0"/>
               <w:jc w:val="center"/>
             </w:pPr>
             <w:r>
@@ -188,7 +186,7 @@
                 <w:color w:val="5D6A73"/>
                 <w:sz w:val="17"/>
               </w:rPr>
-              <w:t>Response boundary</w:t>
+              <w:t>Privacy boundary</w:t>
             </w:r>
           </w:p>
         </w:tc>
@@ -196,95 +194,43 @@
     </w:tbl>
     <w:p>
       <w:pPr>
-        <w:spacing w:after="40"/>
+        <w:spacing w:after="20"/>
       </w:pPr>
     </w:p>
     <w:p>
       <w:pPr>
-        <w:spacing w:after="160"/>
+        <w:spacing w:before="80" w:after="160"/>
+        <w:ind w:left="115" w:right="115"/>
+        <w:shd w:fill="E8EEF5"/>
+        <w:pBdr>
+          <w:left w:val="single" w:sz="16" w:space="4" w:color="2E74B5"/>
+        </w:pBdr>
       </w:pPr>
       <w:r>
         <w:rPr>
           <w:rFonts w:ascii="Calibri" w:hAnsi="Calibri" w:eastAsia="Calibri"/>
+          <w:b/>
+          <w:color w:val="17324D"/>
+          <w:sz w:val="20"/>
+        </w:rPr>
+        <w:t xml:space="preserve">Privacy: </w:t>
+      </w:r>
+      <w:r>
+        <w:rPr>
+          <w:rFonts w:ascii="Calibri" w:hAnsi="Calibri" w:eastAsia="Calibri"/>
           <w:color w:val="1F2933"/>
-          <w:sz w:val="21"/>
+          <w:sz w:val="20"/>
         </w:rPr>
-        <w:t>Your responses will help determine which workflow problems are most important to solve before application development begins.</w:t>
+        <w:t>Do not include any information that could identify a student or family.</w:t>
       </w:r>
-    </w:p>
-    <w:tbl>
-      <w:tblPr>
-        <w:tblW w:type="dxa" w:w="9360"/>
-        <w:tblLayout w:type="fixed"/>
-        <w:tblLook w:firstColumn="1" w:firstRow="1" w:lastColumn="0" w:lastRow="0" w:noHBand="0" w:noVBand="1" w:val="04A0"/>
-        <w:tblInd w:w="120" w:type="dxa"/>
-        <w:tblBorders>
-          <w:top w:val="single" w:sz="6" w:space="0" w:color="9EB8CA"/>
-          <w:left w:val="single" w:sz="6" w:space="0" w:color="9EB8CA"/>
-          <w:bottom w:val="single" w:sz="6" w:space="0" w:color="9EB8CA"/>
-          <w:right w:val="single" w:sz="6" w:space="0" w:color="9EB8CA"/>
-          <w:insideH w:val="single" w:sz="6" w:space="0" w:color="9EB8CA"/>
-          <w:insideV w:val="single" w:sz="6" w:space="0" w:color="9EB8CA"/>
-        </w:tblBorders>
-      </w:tblPr>
-      <w:tblGrid>
-        <w:gridCol w:w="9360"/>
-      </w:tblGrid>
-      <w:tr>
-        <w:tc>
-          <w:tcPr>
-            <w:tcW w:type="dxa" w:w="9360"/>
-            <w:tcMar>
-              <w:top w:w="100" w:type="dxa"/>
-              <w:start w:w="120" w:type="dxa"/>
-              <w:bottom w:w="100" w:type="dxa"/>
-              <w:end w:w="120" w:type="dxa"/>
-            </w:tcMar>
-            <w:vAlign w:val="center"/>
-            <w:shd w:fill="E8EEF5"/>
-          </w:tcPr>
-          <w:p>
-            <w:pPr>
-              <w:spacing w:before="20" w:after="40"/>
-            </w:pPr>
-            <w:r>
-              <w:rPr>
-                <w:rFonts w:ascii="Calibri" w:hAnsi="Calibri" w:eastAsia="Calibri"/>
-                <w:b/>
-                <w:color w:val="17324D"/>
-                <w:sz w:val="21"/>
-              </w:rPr>
-              <w:t>Privacy note</w:t>
-            </w:r>
-          </w:p>
-          <w:p>
-            <w:pPr>
-              <w:spacing w:before="0" w:after="20"/>
-            </w:pPr>
-            <w:r>
-              <w:rPr>
-                <w:rFonts w:ascii="Calibri" w:hAnsi="Calibri" w:eastAsia="Calibri"/>
-                <w:color w:val="1F2933"/>
-                <w:sz w:val="20"/>
-              </w:rPr>
-              <w:t>Do not include student names, initials, dates of birth, student IDs, contact information, or any other information that could identify a student or family. Generalized examples are sufficient.</w:t>
-            </w:r>
-          </w:p>
-        </w:tc>
-      </w:tr>
-    </w:tbl>
-    <w:p>
-      <w:pPr>
-        <w:spacing w:after="40"/>
-      </w:pPr>
     </w:p>
     <w:p>
       <w:pPr>
         <w:pStyle w:val="Heading1"/>
-        <w:keepNext/>
+        <w:pageBreakBefore w:val="0"/>
       </w:pPr>
       <w:r>
-        <w:t>1. Your role and setting</w:t>
+        <w:t>Your current work</w:t>
       </w:r>
     </w:p>
     <w:p>
@@ -297,7 +243,7 @@
         <w:pStyle w:val="Question"/>
       </w:pPr>
       <w:r>
-        <w:t>What is your current role?</w:t>
+        <w:t>What is your role?</w:t>
       </w:r>
     </w:p>
     <w:p>
@@ -413,7 +359,7 @@
           <w:color w:val="1F2933"/>
           <w:sz w:val="21"/>
         </w:rPr>
-        <w:t>Clinical or student-support supervisor</w:t>
+        <w:t>Supervisor or student-support leader</w:t>
       </w:r>
     </w:p>
     <w:p>
@@ -455,7 +401,7 @@
         <w:pStyle w:val="Question"/>
       </w:pPr>
       <w:r>
-        <w:t>Which grade levels do you primarily support? Select all that apply.</w:t>
+        <w:t>Which items are hardest to keep track of? Select up to three.</w:t>
       </w:r>
     </w:p>
     <w:p>
@@ -484,7 +430,7 @@
           <w:color w:val="1F2933"/>
           <w:sz w:val="21"/>
         </w:rPr>
-        <w:t>Pre-K</w:t>
+        <w:t>Student, family, or staff follow-ups</w:t>
       </w:r>
     </w:p>
     <w:p>
@@ -513,7 +459,7 @@
           <w:color w:val="1F2933"/>
           <w:sz w:val="21"/>
         </w:rPr>
-        <w:t>Elementary school</w:t>
+        <w:t>Action items from meetings</w:t>
       </w:r>
     </w:p>
     <w:p>
@@ -542,7 +488,7 @@
           <w:color w:val="1F2933"/>
           <w:sz w:val="21"/>
         </w:rPr>
-        <w:t>Middle school</w:t>
+        <w:t>Interventions that need review</w:t>
       </w:r>
     </w:p>
     <w:p>
@@ -571,7 +517,7 @@
           <w:color w:val="1F2933"/>
           <w:sz w:val="21"/>
         </w:rPr>
-        <w:t>High school</w:t>
+        <w:t>Referrals that are waiting or unresolved</w:t>
       </w:r>
     </w:p>
     <w:p>
@@ -600,20 +546,7 @@
           <w:color w:val="1F2933"/>
           <w:sz w:val="21"/>
         </w:rPr>
-        <w:t>Transition/postsecondary program</w:t>
-      </w:r>
-    </w:p>
-    <w:p>
-      <w:pPr>
-        <w:keepNext/>
-        <w:numPr>
-          <w:ilvl w:val="0"/>
-          <w:numId w:val="10"/>
-        </w:numPr>
-        <w:pStyle w:val="Question"/>
-      </w:pPr>
-      <w:r>
-        <w:t>How would you describe your school or district setting?</w:t>
+        <w:t>Documentation still owed</w:t>
       </w:r>
     </w:p>
     <w:p>
@@ -642,7 +575,7 @@
           <w:color w:val="1F2933"/>
           <w:sz w:val="21"/>
         </w:rPr>
-        <w:t>Urban</w:t>
+        <w:t>Tasks assigned to someone else</w:t>
       </w:r>
     </w:p>
     <w:p>
@@ -671,36 +604,7 @@
           <w:color w:val="1F2933"/>
           <w:sz w:val="21"/>
         </w:rPr>
-        <w:t>Suburban</w:t>
-      </w:r>
-    </w:p>
-    <w:p>
-      <w:pPr>
-        <w:pStyle w:val="ResponseOption"/>
-      </w:pPr>
-      <w:r>
-        <w:rPr>
-          <w:rFonts w:ascii="Segoe UI Symbol" w:hAnsi="Segoe UI Symbol" w:eastAsia="Segoe UI Symbol"/>
-          <w:color w:val="1F2933"/>
-          <w:sz w:val="24"/>
-        </w:rPr>
-        <w:t>☐</w:t>
-      </w:r>
-      <w:r>
-        <w:rPr>
-          <w:rFonts w:ascii="Calibri" w:hAnsi="Calibri" w:eastAsia="Calibri"/>
-          <w:color w:val="1F2933"/>
-          <w:sz w:val="21"/>
-        </w:rPr>
-        <w:t xml:space="preserve">  </w:t>
-      </w:r>
-      <w:r>
-        <w:rPr>
-          <w:rFonts w:ascii="Calibri" w:hAnsi="Calibri" w:eastAsia="Calibri"/>
-          <w:color w:val="1F2933"/>
-          <w:sz w:val="21"/>
-        </w:rPr>
-        <w:t>Rural</w:t>
+        <w:t>Changes in a student’s situation</w:t>
       </w:r>
     </w:p>
     <w:p>
@@ -742,979 +646,7 @@
         <w:pStyle w:val="Question"/>
       </w:pPr>
       <w:r>
-        <w:t>Approximately how many students are on your active caseload?</w:t>
-      </w:r>
-    </w:p>
-    <w:p>
-      <w:pPr>
-        <w:pStyle w:val="ResponseOption"/>
-      </w:pPr>
-      <w:r>
-        <w:rPr>
-          <w:rFonts w:ascii="Segoe UI Symbol" w:hAnsi="Segoe UI Symbol" w:eastAsia="Segoe UI Symbol"/>
-          <w:color w:val="1F2933"/>
-          <w:sz w:val="24"/>
-        </w:rPr>
-        <w:t>☐</w:t>
-      </w:r>
-      <w:r>
-        <w:rPr>
-          <w:rFonts w:ascii="Calibri" w:hAnsi="Calibri" w:eastAsia="Calibri"/>
-          <w:color w:val="1F2933"/>
-          <w:sz w:val="21"/>
-        </w:rPr>
-        <w:t xml:space="preserve">  </w:t>
-      </w:r>
-      <w:r>
-        <w:rPr>
-          <w:rFonts w:ascii="Calibri" w:hAnsi="Calibri" w:eastAsia="Calibri"/>
-          <w:color w:val="1F2933"/>
-          <w:sz w:val="21"/>
-        </w:rPr>
-        <w:t>Fewer than 25</w:t>
-      </w:r>
-    </w:p>
-    <w:p>
-      <w:pPr>
-        <w:pStyle w:val="ResponseOption"/>
-      </w:pPr>
-      <w:r>
-        <w:rPr>
-          <w:rFonts w:ascii="Segoe UI Symbol" w:hAnsi="Segoe UI Symbol" w:eastAsia="Segoe UI Symbol"/>
-          <w:color w:val="1F2933"/>
-          <w:sz w:val="24"/>
-        </w:rPr>
-        <w:t>☐</w:t>
-      </w:r>
-      <w:r>
-        <w:rPr>
-          <w:rFonts w:ascii="Calibri" w:hAnsi="Calibri" w:eastAsia="Calibri"/>
-          <w:color w:val="1F2933"/>
-          <w:sz w:val="21"/>
-        </w:rPr>
-        <w:t xml:space="preserve">  </w:t>
-      </w:r>
-      <w:r>
-        <w:rPr>
-          <w:rFonts w:ascii="Calibri" w:hAnsi="Calibri" w:eastAsia="Calibri"/>
-          <w:color w:val="1F2933"/>
-          <w:sz w:val="21"/>
-        </w:rPr>
-        <w:t>25–49</w:t>
-      </w:r>
-    </w:p>
-    <w:p>
-      <w:pPr>
-        <w:pStyle w:val="ResponseOption"/>
-      </w:pPr>
-      <w:r>
-        <w:rPr>
-          <w:rFonts w:ascii="Segoe UI Symbol" w:hAnsi="Segoe UI Symbol" w:eastAsia="Segoe UI Symbol"/>
-          <w:color w:val="1F2933"/>
-          <w:sz w:val="24"/>
-        </w:rPr>
-        <w:t>☐</w:t>
-      </w:r>
-      <w:r>
-        <w:rPr>
-          <w:rFonts w:ascii="Calibri" w:hAnsi="Calibri" w:eastAsia="Calibri"/>
-          <w:color w:val="1F2933"/>
-          <w:sz w:val="21"/>
-        </w:rPr>
-        <w:t xml:space="preserve">  </w:t>
-      </w:r>
-      <w:r>
-        <w:rPr>
-          <w:rFonts w:ascii="Calibri" w:hAnsi="Calibri" w:eastAsia="Calibri"/>
-          <w:color w:val="1F2933"/>
-          <w:sz w:val="21"/>
-        </w:rPr>
-        <w:t>50–74</w:t>
-      </w:r>
-    </w:p>
-    <w:p>
-      <w:pPr>
-        <w:pStyle w:val="ResponseOption"/>
-      </w:pPr>
-      <w:r>
-        <w:rPr>
-          <w:rFonts w:ascii="Segoe UI Symbol" w:hAnsi="Segoe UI Symbol" w:eastAsia="Segoe UI Symbol"/>
-          <w:color w:val="1F2933"/>
-          <w:sz w:val="24"/>
-        </w:rPr>
-        <w:t>☐</w:t>
-      </w:r>
-      <w:r>
-        <w:rPr>
-          <w:rFonts w:ascii="Calibri" w:hAnsi="Calibri" w:eastAsia="Calibri"/>
-          <w:color w:val="1F2933"/>
-          <w:sz w:val="21"/>
-        </w:rPr>
-        <w:t xml:space="preserve">  </w:t>
-      </w:r>
-      <w:r>
-        <w:rPr>
-          <w:rFonts w:ascii="Calibri" w:hAnsi="Calibri" w:eastAsia="Calibri"/>
-          <w:color w:val="1F2933"/>
-          <w:sz w:val="21"/>
-        </w:rPr>
-        <w:t>75–99</w:t>
-      </w:r>
-    </w:p>
-    <w:p>
-      <w:pPr>
-        <w:pStyle w:val="ResponseOption"/>
-      </w:pPr>
-      <w:r>
-        <w:rPr>
-          <w:rFonts w:ascii="Segoe UI Symbol" w:hAnsi="Segoe UI Symbol" w:eastAsia="Segoe UI Symbol"/>
-          <w:color w:val="1F2933"/>
-          <w:sz w:val="24"/>
-        </w:rPr>
-        <w:t>☐</w:t>
-      </w:r>
-      <w:r>
-        <w:rPr>
-          <w:rFonts w:ascii="Calibri" w:hAnsi="Calibri" w:eastAsia="Calibri"/>
-          <w:color w:val="1F2933"/>
-          <w:sz w:val="21"/>
-        </w:rPr>
-        <w:t xml:space="preserve">  </w:t>
-      </w:r>
-      <w:r>
-        <w:rPr>
-          <w:rFonts w:ascii="Calibri" w:hAnsi="Calibri" w:eastAsia="Calibri"/>
-          <w:color w:val="1F2933"/>
-          <w:sz w:val="21"/>
-        </w:rPr>
-        <w:t>100 or more</w:t>
-      </w:r>
-    </w:p>
-    <w:p>
-      <w:pPr>
-        <w:pStyle w:val="ResponseOption"/>
-      </w:pPr>
-      <w:r>
-        <w:rPr>
-          <w:rFonts w:ascii="Segoe UI Symbol" w:hAnsi="Segoe UI Symbol" w:eastAsia="Segoe UI Symbol"/>
-          <w:color w:val="1F2933"/>
-          <w:sz w:val="24"/>
-        </w:rPr>
-        <w:t>☐</w:t>
-      </w:r>
-      <w:r>
-        <w:rPr>
-          <w:rFonts w:ascii="Calibri" w:hAnsi="Calibri" w:eastAsia="Calibri"/>
-          <w:color w:val="1F2933"/>
-          <w:sz w:val="21"/>
-        </w:rPr>
-        <w:t xml:space="preserve">  </w:t>
-      </w:r>
-      <w:r>
-        <w:rPr>
-          <w:rFonts w:ascii="Calibri" w:hAnsi="Calibri" w:eastAsia="Calibri"/>
-          <w:color w:val="1F2933"/>
-          <w:sz w:val="21"/>
-        </w:rPr>
-        <w:t>Caseload size is not applicable to my role</w:t>
-      </w:r>
-    </w:p>
-    <w:p>
-      <w:pPr>
-        <w:keepNext/>
-        <w:numPr>
-          <w:ilvl w:val="0"/>
-          <w:numId w:val="10"/>
-        </w:numPr>
-        <w:pStyle w:val="Question"/>
-      </w:pPr>
-      <w:r>
-        <w:t>How many years have you worked in school-based mental health or student support?</w:t>
-      </w:r>
-    </w:p>
-    <w:p>
-      <w:pPr>
-        <w:pStyle w:val="ResponseOption"/>
-      </w:pPr>
-      <w:r>
-        <w:rPr>
-          <w:rFonts w:ascii="Segoe UI Symbol" w:hAnsi="Segoe UI Symbol" w:eastAsia="Segoe UI Symbol"/>
-          <w:color w:val="1F2933"/>
-          <w:sz w:val="24"/>
-        </w:rPr>
-        <w:t>☐</w:t>
-      </w:r>
-      <w:r>
-        <w:rPr>
-          <w:rFonts w:ascii="Calibri" w:hAnsi="Calibri" w:eastAsia="Calibri"/>
-          <w:color w:val="1F2933"/>
-          <w:sz w:val="21"/>
-        </w:rPr>
-        <w:t xml:space="preserve">  </w:t>
-      </w:r>
-      <w:r>
-        <w:rPr>
-          <w:rFonts w:ascii="Calibri" w:hAnsi="Calibri" w:eastAsia="Calibri"/>
-          <w:color w:val="1F2933"/>
-          <w:sz w:val="21"/>
-        </w:rPr>
-        <w:t>Less than 2 years</w:t>
-      </w:r>
-    </w:p>
-    <w:p>
-      <w:pPr>
-        <w:pStyle w:val="ResponseOption"/>
-      </w:pPr>
-      <w:r>
-        <w:rPr>
-          <w:rFonts w:ascii="Segoe UI Symbol" w:hAnsi="Segoe UI Symbol" w:eastAsia="Segoe UI Symbol"/>
-          <w:color w:val="1F2933"/>
-          <w:sz w:val="24"/>
-        </w:rPr>
-        <w:t>☐</w:t>
-      </w:r>
-      <w:r>
-        <w:rPr>
-          <w:rFonts w:ascii="Calibri" w:hAnsi="Calibri" w:eastAsia="Calibri"/>
-          <w:color w:val="1F2933"/>
-          <w:sz w:val="21"/>
-        </w:rPr>
-        <w:t xml:space="preserve">  </w:t>
-      </w:r>
-      <w:r>
-        <w:rPr>
-          <w:rFonts w:ascii="Calibri" w:hAnsi="Calibri" w:eastAsia="Calibri"/>
-          <w:color w:val="1F2933"/>
-          <w:sz w:val="21"/>
-        </w:rPr>
-        <w:t>2–5 years</w:t>
-      </w:r>
-    </w:p>
-    <w:p>
-      <w:pPr>
-        <w:pStyle w:val="ResponseOption"/>
-      </w:pPr>
-      <w:r>
-        <w:rPr>
-          <w:rFonts w:ascii="Segoe UI Symbol" w:hAnsi="Segoe UI Symbol" w:eastAsia="Segoe UI Symbol"/>
-          <w:color w:val="1F2933"/>
-          <w:sz w:val="24"/>
-        </w:rPr>
-        <w:t>☐</w:t>
-      </w:r>
-      <w:r>
-        <w:rPr>
-          <w:rFonts w:ascii="Calibri" w:hAnsi="Calibri" w:eastAsia="Calibri"/>
-          <w:color w:val="1F2933"/>
-          <w:sz w:val="21"/>
-        </w:rPr>
-        <w:t xml:space="preserve">  </w:t>
-      </w:r>
-      <w:r>
-        <w:rPr>
-          <w:rFonts w:ascii="Calibri" w:hAnsi="Calibri" w:eastAsia="Calibri"/>
-          <w:color w:val="1F2933"/>
-          <w:sz w:val="21"/>
-        </w:rPr>
-        <w:t>6–10 years</w:t>
-      </w:r>
-    </w:p>
-    <w:p>
-      <w:pPr>
-        <w:pStyle w:val="ResponseOption"/>
-      </w:pPr>
-      <w:r>
-        <w:rPr>
-          <w:rFonts w:ascii="Segoe UI Symbol" w:hAnsi="Segoe UI Symbol" w:eastAsia="Segoe UI Symbol"/>
-          <w:color w:val="1F2933"/>
-          <w:sz w:val="24"/>
-        </w:rPr>
-        <w:t>☐</w:t>
-      </w:r>
-      <w:r>
-        <w:rPr>
-          <w:rFonts w:ascii="Calibri" w:hAnsi="Calibri" w:eastAsia="Calibri"/>
-          <w:color w:val="1F2933"/>
-          <w:sz w:val="21"/>
-        </w:rPr>
-        <w:t xml:space="preserve">  </w:t>
-      </w:r>
-      <w:r>
-        <w:rPr>
-          <w:rFonts w:ascii="Calibri" w:hAnsi="Calibri" w:eastAsia="Calibri"/>
-          <w:color w:val="1F2933"/>
-          <w:sz w:val="21"/>
-        </w:rPr>
-        <w:t>More than 10 years</w:t>
-      </w:r>
-    </w:p>
-    <w:p>
-      <w:pPr>
-        <w:pStyle w:val="Heading1"/>
-        <w:keepNext/>
-      </w:pPr>
-      <w:r>
-        <w:t>2. Your current workflow</w:t>
-      </w:r>
-    </w:p>
-    <w:p>
-      <w:pPr>
-        <w:keepNext/>
-        <w:numPr>
-          <w:ilvl w:val="0"/>
-          <w:numId w:val="10"/>
-        </w:numPr>
-        <w:pStyle w:val="Question"/>
-      </w:pPr>
-      <w:r>
-        <w:t>Which tools do you currently use to manage student-support work? Select all that apply.</w:t>
-      </w:r>
-    </w:p>
-    <w:p>
-      <w:pPr>
-        <w:pStyle w:val="ResponseOption"/>
-      </w:pPr>
-      <w:r>
-        <w:rPr>
-          <w:rFonts w:ascii="Segoe UI Symbol" w:hAnsi="Segoe UI Symbol" w:eastAsia="Segoe UI Symbol"/>
-          <w:color w:val="1F2933"/>
-          <w:sz w:val="24"/>
-        </w:rPr>
-        <w:t>☐</w:t>
-      </w:r>
-      <w:r>
-        <w:rPr>
-          <w:rFonts w:ascii="Calibri" w:hAnsi="Calibri" w:eastAsia="Calibri"/>
-          <w:color w:val="1F2933"/>
-          <w:sz w:val="21"/>
-        </w:rPr>
-        <w:t xml:space="preserve">  </w:t>
-      </w:r>
-      <w:r>
-        <w:rPr>
-          <w:rFonts w:ascii="Calibri" w:hAnsi="Calibri" w:eastAsia="Calibri"/>
-          <w:color w:val="1F2933"/>
-          <w:sz w:val="21"/>
-        </w:rPr>
-        <w:t>Student information system (SIS)</w:t>
-      </w:r>
-    </w:p>
-    <w:p>
-      <w:pPr>
-        <w:pStyle w:val="ResponseOption"/>
-      </w:pPr>
-      <w:r>
-        <w:rPr>
-          <w:rFonts w:ascii="Segoe UI Symbol" w:hAnsi="Segoe UI Symbol" w:eastAsia="Segoe UI Symbol"/>
-          <w:color w:val="1F2933"/>
-          <w:sz w:val="24"/>
-        </w:rPr>
-        <w:t>☐</w:t>
-      </w:r>
-      <w:r>
-        <w:rPr>
-          <w:rFonts w:ascii="Calibri" w:hAnsi="Calibri" w:eastAsia="Calibri"/>
-          <w:color w:val="1F2933"/>
-          <w:sz w:val="21"/>
-        </w:rPr>
-        <w:t xml:space="preserve">  </w:t>
-      </w:r>
-      <w:r>
-        <w:rPr>
-          <w:rFonts w:ascii="Calibri" w:hAnsi="Calibri" w:eastAsia="Calibri"/>
-          <w:color w:val="1F2933"/>
-          <w:sz w:val="21"/>
-        </w:rPr>
-        <w:t>IEP/504 or special-education system</w:t>
-      </w:r>
-    </w:p>
-    <w:p>
-      <w:pPr>
-        <w:pStyle w:val="ResponseOption"/>
-      </w:pPr>
-      <w:r>
-        <w:rPr>
-          <w:rFonts w:ascii="Segoe UI Symbol" w:hAnsi="Segoe UI Symbol" w:eastAsia="Segoe UI Symbol"/>
-          <w:color w:val="1F2933"/>
-          <w:sz w:val="24"/>
-        </w:rPr>
-        <w:t>☐</w:t>
-      </w:r>
-      <w:r>
-        <w:rPr>
-          <w:rFonts w:ascii="Calibri" w:hAnsi="Calibri" w:eastAsia="Calibri"/>
-          <w:color w:val="1F2933"/>
-          <w:sz w:val="21"/>
-        </w:rPr>
-        <w:t xml:space="preserve">  </w:t>
-      </w:r>
-      <w:r>
-        <w:rPr>
-          <w:rFonts w:ascii="Calibri" w:hAnsi="Calibri" w:eastAsia="Calibri"/>
-          <w:color w:val="1F2933"/>
-          <w:sz w:val="21"/>
-        </w:rPr>
-        <w:t>Electronic health or case-management system</w:t>
-      </w:r>
-    </w:p>
-    <w:p>
-      <w:pPr>
-        <w:pStyle w:val="ResponseOption"/>
-      </w:pPr>
-      <w:r>
-        <w:rPr>
-          <w:rFonts w:ascii="Segoe UI Symbol" w:hAnsi="Segoe UI Symbol" w:eastAsia="Segoe UI Symbol"/>
-          <w:color w:val="1F2933"/>
-          <w:sz w:val="24"/>
-        </w:rPr>
-        <w:t>☐</w:t>
-      </w:r>
-      <w:r>
-        <w:rPr>
-          <w:rFonts w:ascii="Calibri" w:hAnsi="Calibri" w:eastAsia="Calibri"/>
-          <w:color w:val="1F2933"/>
-          <w:sz w:val="21"/>
-        </w:rPr>
-        <w:t xml:space="preserve">  </w:t>
-      </w:r>
-      <w:r>
-        <w:rPr>
-          <w:rFonts w:ascii="Calibri" w:hAnsi="Calibri" w:eastAsia="Calibri"/>
-          <w:color w:val="1F2933"/>
-          <w:sz w:val="21"/>
-        </w:rPr>
-        <w:t>Email</w:t>
-      </w:r>
-    </w:p>
-    <w:p>
-      <w:pPr>
-        <w:pStyle w:val="ResponseOption"/>
-      </w:pPr>
-      <w:r>
-        <w:rPr>
-          <w:rFonts w:ascii="Segoe UI Symbol" w:hAnsi="Segoe UI Symbol" w:eastAsia="Segoe UI Symbol"/>
-          <w:color w:val="1F2933"/>
-          <w:sz w:val="24"/>
-        </w:rPr>
-        <w:t>☐</w:t>
-      </w:r>
-      <w:r>
-        <w:rPr>
-          <w:rFonts w:ascii="Calibri" w:hAnsi="Calibri" w:eastAsia="Calibri"/>
-          <w:color w:val="1F2933"/>
-          <w:sz w:val="21"/>
-        </w:rPr>
-        <w:t xml:space="preserve">  </w:t>
-      </w:r>
-      <w:r>
-        <w:rPr>
-          <w:rFonts w:ascii="Calibri" w:hAnsi="Calibri" w:eastAsia="Calibri"/>
-          <w:color w:val="1F2933"/>
-          <w:sz w:val="21"/>
-        </w:rPr>
-        <w:t>Calendar</w:t>
-      </w:r>
-    </w:p>
-    <w:p>
-      <w:pPr>
-        <w:pStyle w:val="ResponseOption"/>
-      </w:pPr>
-      <w:r>
-        <w:rPr>
-          <w:rFonts w:ascii="Segoe UI Symbol" w:hAnsi="Segoe UI Symbol" w:eastAsia="Segoe UI Symbol"/>
-          <w:color w:val="1F2933"/>
-          <w:sz w:val="24"/>
-        </w:rPr>
-        <w:t>☐</w:t>
-      </w:r>
-      <w:r>
-        <w:rPr>
-          <w:rFonts w:ascii="Calibri" w:hAnsi="Calibri" w:eastAsia="Calibri"/>
-          <w:color w:val="1F2933"/>
-          <w:sz w:val="21"/>
-        </w:rPr>
-        <w:t xml:space="preserve">  </w:t>
-      </w:r>
-      <w:r>
-        <w:rPr>
-          <w:rFonts w:ascii="Calibri" w:hAnsi="Calibri" w:eastAsia="Calibri"/>
-          <w:color w:val="1F2933"/>
-          <w:sz w:val="21"/>
-        </w:rPr>
-        <w:t>Spreadsheet</w:t>
-      </w:r>
-    </w:p>
-    <w:p>
-      <w:pPr>
-        <w:pStyle w:val="ResponseOption"/>
-      </w:pPr>
-      <w:r>
-        <w:rPr>
-          <w:rFonts w:ascii="Segoe UI Symbol" w:hAnsi="Segoe UI Symbol" w:eastAsia="Segoe UI Symbol"/>
-          <w:color w:val="1F2933"/>
-          <w:sz w:val="24"/>
-        </w:rPr>
-        <w:t>☐</w:t>
-      </w:r>
-      <w:r>
-        <w:rPr>
-          <w:rFonts w:ascii="Calibri" w:hAnsi="Calibri" w:eastAsia="Calibri"/>
-          <w:color w:val="1F2933"/>
-          <w:sz w:val="21"/>
-        </w:rPr>
-        <w:t xml:space="preserve">  </w:t>
-      </w:r>
-      <w:r>
-        <w:rPr>
-          <w:rFonts w:ascii="Calibri" w:hAnsi="Calibri" w:eastAsia="Calibri"/>
-          <w:color w:val="1F2933"/>
-          <w:sz w:val="21"/>
-        </w:rPr>
-        <w:t>Paper notes or planner</w:t>
-      </w:r>
-    </w:p>
-    <w:p>
-      <w:pPr>
-        <w:pStyle w:val="ResponseOption"/>
-      </w:pPr>
-      <w:r>
-        <w:rPr>
-          <w:rFonts w:ascii="Segoe UI Symbol" w:hAnsi="Segoe UI Symbol" w:eastAsia="Segoe UI Symbol"/>
-          <w:color w:val="1F2933"/>
-          <w:sz w:val="24"/>
-        </w:rPr>
-        <w:t>☐</w:t>
-      </w:r>
-      <w:r>
-        <w:rPr>
-          <w:rFonts w:ascii="Calibri" w:hAnsi="Calibri" w:eastAsia="Calibri"/>
-          <w:color w:val="1F2933"/>
-          <w:sz w:val="21"/>
-        </w:rPr>
-        <w:t xml:space="preserve">  </w:t>
-      </w:r>
-      <w:r>
-        <w:rPr>
-          <w:rFonts w:ascii="Calibri" w:hAnsi="Calibri" w:eastAsia="Calibri"/>
-          <w:color w:val="1F2933"/>
-          <w:sz w:val="21"/>
-        </w:rPr>
-        <w:t>Personal task-management application</w:t>
-      </w:r>
-    </w:p>
-    <w:p>
-      <w:pPr>
-        <w:pStyle w:val="ResponseOption"/>
-      </w:pPr>
-      <w:r>
-        <w:rPr>
-          <w:rFonts w:ascii="Segoe UI Symbol" w:hAnsi="Segoe UI Symbol" w:eastAsia="Segoe UI Symbol"/>
-          <w:color w:val="1F2933"/>
-          <w:sz w:val="24"/>
-        </w:rPr>
-        <w:t>☐</w:t>
-      </w:r>
-      <w:r>
-        <w:rPr>
-          <w:rFonts w:ascii="Calibri" w:hAnsi="Calibri" w:eastAsia="Calibri"/>
-          <w:color w:val="1F2933"/>
-          <w:sz w:val="21"/>
-        </w:rPr>
-        <w:t xml:space="preserve">  </w:t>
-      </w:r>
-      <w:r>
-        <w:rPr>
-          <w:rFonts w:ascii="Calibri" w:hAnsi="Calibri" w:eastAsia="Calibri"/>
-          <w:color w:val="1F2933"/>
-          <w:sz w:val="21"/>
-        </w:rPr>
-        <w:t>Shared team documents</w:t>
-      </w:r>
-    </w:p>
-    <w:p>
-      <w:pPr>
-        <w:pStyle w:val="ResponseOption"/>
-      </w:pPr>
-      <w:r>
-        <w:rPr>
-          <w:rFonts w:ascii="Segoe UI Symbol" w:hAnsi="Segoe UI Symbol" w:eastAsia="Segoe UI Symbol"/>
-          <w:color w:val="1F2933"/>
-          <w:sz w:val="24"/>
-        </w:rPr>
-        <w:t>☐</w:t>
-      </w:r>
-      <w:r>
-        <w:rPr>
-          <w:rFonts w:ascii="Calibri" w:hAnsi="Calibri" w:eastAsia="Calibri"/>
-          <w:color w:val="1F2933"/>
-          <w:sz w:val="21"/>
-        </w:rPr>
-        <w:t xml:space="preserve">  </w:t>
-      </w:r>
-      <w:r>
-        <w:rPr>
-          <w:rFonts w:ascii="Calibri" w:hAnsi="Calibri" w:eastAsia="Calibri"/>
-          <w:color w:val="1F2933"/>
-          <w:sz w:val="21"/>
-        </w:rPr>
-        <w:t>Other: ______________________________</w:t>
-      </w:r>
-    </w:p>
-    <w:p>
-      <w:pPr>
-        <w:keepNext/>
-        <w:numPr>
-          <w:ilvl w:val="0"/>
-          <w:numId w:val="10"/>
-        </w:numPr>
-        <w:pStyle w:val="Question"/>
-      </w:pPr>
-      <w:r>
-        <w:t>Which system is considered the official record for your work?</w:t>
-      </w:r>
-    </w:p>
-    <w:p>
-      <w:pPr>
-        <w:pStyle w:val="ResponseLine"/>
-        <w:pBdr>
-          <w:bottom w:val="single" w:sz="6" w:space="2" w:color="C9D5DF"/>
-        </w:pBdr>
-      </w:pPr>
-      <w:r>
-        <w:t xml:space="preserve"> </w:t>
-      </w:r>
-    </w:p>
-    <w:p>
-      <w:pPr>
-        <w:pStyle w:val="ResponseLine"/>
-        <w:pBdr>
-          <w:bottom w:val="single" w:sz="6" w:space="2" w:color="C9D5DF"/>
-        </w:pBdr>
-      </w:pPr>
-      <w:r>
-        <w:t xml:space="preserve"> </w:t>
-      </w:r>
-    </w:p>
-    <w:p>
-      <w:pPr>
-        <w:keepNext/>
-        <w:numPr>
-          <w:ilvl w:val="0"/>
-          <w:numId w:val="10"/>
-        </w:numPr>
-        <w:pStyle w:val="Question"/>
-      </w:pPr>
-      <w:r>
-        <w:t>What information do you track outside the official record, and why?</w:t>
-      </w:r>
-    </w:p>
-    <w:p>
-      <w:pPr>
-        <w:pStyle w:val="ResponseLine"/>
-        <w:pBdr>
-          <w:bottom w:val="single" w:sz="6" w:space="2" w:color="C9D5DF"/>
-        </w:pBdr>
-      </w:pPr>
-      <w:r>
-        <w:t xml:space="preserve"> </w:t>
-      </w:r>
-    </w:p>
-    <w:p>
-      <w:pPr>
-        <w:pStyle w:val="ResponseLine"/>
-        <w:pBdr>
-          <w:bottom w:val="single" w:sz="6" w:space="2" w:color="C9D5DF"/>
-        </w:pBdr>
-      </w:pPr>
-      <w:r>
-        <w:t xml:space="preserve"> </w:t>
-      </w:r>
-    </w:p>
-    <w:p>
-      <w:pPr>
-        <w:keepNext/>
-        <w:numPr>
-          <w:ilvl w:val="0"/>
-          <w:numId w:val="10"/>
-        </w:numPr>
-        <w:pStyle w:val="Question"/>
-      </w:pPr>
-      <w:r>
-        <w:t>At the beginning of a workday or week, how do you decide which students or tasks need attention first?</w:t>
-      </w:r>
-    </w:p>
-    <w:p>
-      <w:pPr>
-        <w:pStyle w:val="ResponseLine"/>
-        <w:pBdr>
-          <w:bottom w:val="single" w:sz="6" w:space="2" w:color="C9D5DF"/>
-        </w:pBdr>
-      </w:pPr>
-      <w:r>
-        <w:t xml:space="preserve"> </w:t>
-      </w:r>
-    </w:p>
-    <w:p>
-      <w:pPr>
-        <w:pStyle w:val="ResponseLine"/>
-        <w:pBdr>
-          <w:bottom w:val="single" w:sz="6" w:space="2" w:color="C9D5DF"/>
-        </w:pBdr>
-      </w:pPr>
-      <w:r>
-        <w:t xml:space="preserve"> </w:t>
-      </w:r>
-    </w:p>
-    <w:p>
-      <w:pPr>
-        <w:keepNext/>
-        <w:numPr>
-          <w:ilvl w:val="0"/>
-          <w:numId w:val="10"/>
-        </w:numPr>
-        <w:pStyle w:val="Question"/>
-      </w:pPr>
-      <w:r>
-        <w:t>How much time do you typically spend reconstructing a student’s recent history before a meeting, follow-up, or decision?</w:t>
-      </w:r>
-    </w:p>
-    <w:p>
-      <w:pPr>
-        <w:pStyle w:val="ResponseOption"/>
-      </w:pPr>
-      <w:r>
-        <w:rPr>
-          <w:rFonts w:ascii="Segoe UI Symbol" w:hAnsi="Segoe UI Symbol" w:eastAsia="Segoe UI Symbol"/>
-          <w:color w:val="1F2933"/>
-          <w:sz w:val="24"/>
-        </w:rPr>
-        <w:t>☐</w:t>
-      </w:r>
-      <w:r>
-        <w:rPr>
-          <w:rFonts w:ascii="Calibri" w:hAnsi="Calibri" w:eastAsia="Calibri"/>
-          <w:color w:val="1F2933"/>
-          <w:sz w:val="21"/>
-        </w:rPr>
-        <w:t xml:space="preserve">  </w:t>
-      </w:r>
-      <w:r>
-        <w:rPr>
-          <w:rFonts w:ascii="Calibri" w:hAnsi="Calibri" w:eastAsia="Calibri"/>
-          <w:color w:val="1F2933"/>
-          <w:sz w:val="21"/>
-        </w:rPr>
-        <w:t>Less than 5 minutes</w:t>
-      </w:r>
-    </w:p>
-    <w:p>
-      <w:pPr>
-        <w:pStyle w:val="ResponseOption"/>
-      </w:pPr>
-      <w:r>
-        <w:rPr>
-          <w:rFonts w:ascii="Segoe UI Symbol" w:hAnsi="Segoe UI Symbol" w:eastAsia="Segoe UI Symbol"/>
-          <w:color w:val="1F2933"/>
-          <w:sz w:val="24"/>
-        </w:rPr>
-        <w:t>☐</w:t>
-      </w:r>
-      <w:r>
-        <w:rPr>
-          <w:rFonts w:ascii="Calibri" w:hAnsi="Calibri" w:eastAsia="Calibri"/>
-          <w:color w:val="1F2933"/>
-          <w:sz w:val="21"/>
-        </w:rPr>
-        <w:t xml:space="preserve">  </w:t>
-      </w:r>
-      <w:r>
-        <w:rPr>
-          <w:rFonts w:ascii="Calibri" w:hAnsi="Calibri" w:eastAsia="Calibri"/>
-          <w:color w:val="1F2933"/>
-          <w:sz w:val="21"/>
-        </w:rPr>
-        <w:t>5–15 minutes</w:t>
-      </w:r>
-    </w:p>
-    <w:p>
-      <w:pPr>
-        <w:pStyle w:val="ResponseOption"/>
-      </w:pPr>
-      <w:r>
-        <w:rPr>
-          <w:rFonts w:ascii="Segoe UI Symbol" w:hAnsi="Segoe UI Symbol" w:eastAsia="Segoe UI Symbol"/>
-          <w:color w:val="1F2933"/>
-          <w:sz w:val="24"/>
-        </w:rPr>
-        <w:t>☐</w:t>
-      </w:r>
-      <w:r>
-        <w:rPr>
-          <w:rFonts w:ascii="Calibri" w:hAnsi="Calibri" w:eastAsia="Calibri"/>
-          <w:color w:val="1F2933"/>
-          <w:sz w:val="21"/>
-        </w:rPr>
-        <w:t xml:space="preserve">  </w:t>
-      </w:r>
-      <w:r>
-        <w:rPr>
-          <w:rFonts w:ascii="Calibri" w:hAnsi="Calibri" w:eastAsia="Calibri"/>
-          <w:color w:val="1F2933"/>
-          <w:sz w:val="21"/>
-        </w:rPr>
-        <w:t>16–30 minutes</w:t>
-      </w:r>
-    </w:p>
-    <w:p>
-      <w:pPr>
-        <w:pStyle w:val="ResponseOption"/>
-      </w:pPr>
-      <w:r>
-        <w:rPr>
-          <w:rFonts w:ascii="Segoe UI Symbol" w:hAnsi="Segoe UI Symbol" w:eastAsia="Segoe UI Symbol"/>
-          <w:color w:val="1F2933"/>
-          <w:sz w:val="24"/>
-        </w:rPr>
-        <w:t>☐</w:t>
-      </w:r>
-      <w:r>
-        <w:rPr>
-          <w:rFonts w:ascii="Calibri" w:hAnsi="Calibri" w:eastAsia="Calibri"/>
-          <w:color w:val="1F2933"/>
-          <w:sz w:val="21"/>
-        </w:rPr>
-        <w:t xml:space="preserve">  </w:t>
-      </w:r>
-      <w:r>
-        <w:rPr>
-          <w:rFonts w:ascii="Calibri" w:hAnsi="Calibri" w:eastAsia="Calibri"/>
-          <w:color w:val="1F2933"/>
-          <w:sz w:val="21"/>
-        </w:rPr>
-        <w:t>31–60 minutes</w:t>
-      </w:r>
-    </w:p>
-    <w:p>
-      <w:pPr>
-        <w:pStyle w:val="ResponseOption"/>
-      </w:pPr>
-      <w:r>
-        <w:rPr>
-          <w:rFonts w:ascii="Segoe UI Symbol" w:hAnsi="Segoe UI Symbol" w:eastAsia="Segoe UI Symbol"/>
-          <w:color w:val="1F2933"/>
-          <w:sz w:val="24"/>
-        </w:rPr>
-        <w:t>☐</w:t>
-      </w:r>
-      <w:r>
-        <w:rPr>
-          <w:rFonts w:ascii="Calibri" w:hAnsi="Calibri" w:eastAsia="Calibri"/>
-          <w:color w:val="1F2933"/>
-          <w:sz w:val="21"/>
-        </w:rPr>
-        <w:t xml:space="preserve">  </w:t>
-      </w:r>
-      <w:r>
-        <w:rPr>
-          <w:rFonts w:ascii="Calibri" w:hAnsi="Calibri" w:eastAsia="Calibri"/>
-          <w:color w:val="1F2933"/>
-          <w:sz w:val="21"/>
-        </w:rPr>
-        <w:t>More than 60 minutes</w:t>
-      </w:r>
-    </w:p>
-    <w:p>
-      <w:pPr>
-        <w:pStyle w:val="ResponseOption"/>
-      </w:pPr>
-      <w:r>
-        <w:rPr>
-          <w:rFonts w:ascii="Segoe UI Symbol" w:hAnsi="Segoe UI Symbol" w:eastAsia="Segoe UI Symbol"/>
-          <w:color w:val="1F2933"/>
-          <w:sz w:val="24"/>
-        </w:rPr>
-        <w:t>☐</w:t>
-      </w:r>
-      <w:r>
-        <w:rPr>
-          <w:rFonts w:ascii="Calibri" w:hAnsi="Calibri" w:eastAsia="Calibri"/>
-          <w:color w:val="1F2933"/>
-          <w:sz w:val="21"/>
-        </w:rPr>
-        <w:t xml:space="preserve">  </w:t>
-      </w:r>
-      <w:r>
-        <w:rPr>
-          <w:rFonts w:ascii="Calibri" w:hAnsi="Calibri" w:eastAsia="Calibri"/>
-          <w:color w:val="1F2933"/>
-          <w:sz w:val="21"/>
-        </w:rPr>
-        <w:t>It varies too much to estimate</w:t>
-      </w:r>
-    </w:p>
-    <w:p>
-      <w:pPr>
-        <w:pStyle w:val="Heading1"/>
-        <w:keepNext/>
-      </w:pPr>
-      <w:r>
-        <w:t>3. Follow-ups and ‘loose ends’</w:t>
-      </w:r>
-    </w:p>
-    <w:p>
-      <w:pPr>
-        <w:spacing w:after="160"/>
-      </w:pPr>
-      <w:r>
-        <w:rPr>
-          <w:rFonts w:ascii="Calibri" w:hAnsi="Calibri" w:eastAsia="Calibri"/>
-          <w:i/>
-          <w:color w:val="5D6A73"/>
-          <w:sz w:val="20"/>
-        </w:rPr>
-        <w:t>A loose end is something related to a student that still needs an action, answer, decision, review, or documented outcome.</w:t>
-      </w:r>
-    </w:p>
-    <w:p>
-      <w:pPr>
-        <w:keepNext/>
-        <w:numPr>
-          <w:ilvl w:val="0"/>
-          <w:numId w:val="10"/>
-        </w:numPr>
-        <w:pStyle w:val="Question"/>
-      </w:pPr>
-      <w:r>
-        <w:t>How often do important follow-ups become difficult to track across your caseload?</w:t>
-      </w:r>
-    </w:p>
-    <w:p>
-      <w:pPr>
-        <w:pStyle w:val="ResponseOption"/>
-      </w:pPr>
-      <w:r>
-        <w:rPr>
-          <w:rFonts w:ascii="Segoe UI Symbol" w:hAnsi="Segoe UI Symbol" w:eastAsia="Segoe UI Symbol"/>
-          <w:color w:val="1F2933"/>
-          <w:sz w:val="24"/>
-        </w:rPr>
-        <w:t>☐</w:t>
-      </w:r>
-      <w:r>
-        <w:rPr>
-          <w:rFonts w:ascii="Calibri" w:hAnsi="Calibri" w:eastAsia="Calibri"/>
-          <w:color w:val="1F2933"/>
-          <w:sz w:val="21"/>
-        </w:rPr>
-        <w:t xml:space="preserve">  </w:t>
-      </w:r>
-      <w:r>
-        <w:rPr>
-          <w:rFonts w:ascii="Calibri" w:hAnsi="Calibri" w:eastAsia="Calibri"/>
-          <w:color w:val="1F2933"/>
-          <w:sz w:val="21"/>
-        </w:rPr>
-        <w:t>Never</w:t>
+        <w:t>How often do important follow-ups become difficult to track?</w:t>
       </w:r>
     </w:p>
     <w:p>
@@ -1843,7 +775,7 @@
         <w:pStyle w:val="Question"/>
       </w:pPr>
       <w:r>
-        <w:t>Which loose ends do you regularly need to remember? Select all that apply.</w:t>
+        <w:t>How do you keep track of follow-ups today? Select all that apply.</w:t>
       </w:r>
     </w:p>
     <w:p>
@@ -1872,7 +804,7 @@
           <w:color w:val="1F2933"/>
           <w:sz w:val="21"/>
         </w:rPr>
-        <w:t>Student follow-up</w:t>
+        <w:t>School or district system</w:t>
       </w:r>
     </w:p>
     <w:p>
@@ -1901,7 +833,7 @@
           <w:color w:val="1F2933"/>
           <w:sz w:val="21"/>
         </w:rPr>
-        <w:t>Parent or caregiver response</w:t>
+        <w:t>Email</w:t>
       </w:r>
     </w:p>
     <w:p>
@@ -1930,7 +862,7 @@
           <w:color w:val="1F2933"/>
           <w:sz w:val="21"/>
         </w:rPr>
-        <w:t>Teacher or administrator follow-up</w:t>
+        <w:t>Calendar or reminders</w:t>
       </w:r>
     </w:p>
     <w:p>
@@ -1959,7 +891,7 @@
           <w:color w:val="1F2933"/>
           <w:sz w:val="21"/>
         </w:rPr>
-        <w:t>Consent or form completion</w:t>
+        <w:t>Spreadsheet</w:t>
       </w:r>
     </w:p>
     <w:p>
@@ -1988,7 +920,7 @@
           <w:color w:val="1F2933"/>
           <w:sz w:val="21"/>
         </w:rPr>
-        <w:t>Meeting scheduling or preparation</w:t>
+        <w:t>Paper notes or planner</w:t>
       </w:r>
     </w:p>
     <w:p>
@@ -2017,7 +949,7 @@
           <w:color w:val="1F2933"/>
           <w:sz w:val="21"/>
         </w:rPr>
-        <w:t>Action items created during a meeting</w:t>
+        <w:t>Personal task-management app</w:t>
       </w:r>
     </w:p>
     <w:p>
@@ -2046,1186 +978,7 @@
           <w:color w:val="1F2933"/>
           <w:sz w:val="21"/>
         </w:rPr>
-        <w:t>Intervention review</w:t>
-      </w:r>
-    </w:p>
-    <w:p>
-      <w:pPr>
-        <w:pStyle w:val="ResponseOption"/>
-      </w:pPr>
-      <w:r>
-        <w:rPr>
-          <w:rFonts w:ascii="Segoe UI Symbol" w:hAnsi="Segoe UI Symbol" w:eastAsia="Segoe UI Symbol"/>
-          <w:color w:val="1F2933"/>
-          <w:sz w:val="24"/>
-        </w:rPr>
-        <w:t>☐</w:t>
-      </w:r>
-      <w:r>
-        <w:rPr>
-          <w:rFonts w:ascii="Calibri" w:hAnsi="Calibri" w:eastAsia="Calibri"/>
-          <w:color w:val="1F2933"/>
-          <w:sz w:val="21"/>
-        </w:rPr>
-        <w:t xml:space="preserve">  </w:t>
-      </w:r>
-      <w:r>
-        <w:rPr>
-          <w:rFonts w:ascii="Calibri" w:hAnsi="Calibri" w:eastAsia="Calibri"/>
-          <w:color w:val="1F2933"/>
-          <w:sz w:val="21"/>
-        </w:rPr>
-        <w:t>Internal referral</w:t>
-      </w:r>
-    </w:p>
-    <w:p>
-      <w:pPr>
-        <w:pStyle w:val="ResponseOption"/>
-      </w:pPr>
-      <w:r>
-        <w:rPr>
-          <w:rFonts w:ascii="Segoe UI Symbol" w:hAnsi="Segoe UI Symbol" w:eastAsia="Segoe UI Symbol"/>
-          <w:color w:val="1F2933"/>
-          <w:sz w:val="24"/>
-        </w:rPr>
-        <w:t>☐</w:t>
-      </w:r>
-      <w:r>
-        <w:rPr>
-          <w:rFonts w:ascii="Calibri" w:hAnsi="Calibri" w:eastAsia="Calibri"/>
-          <w:color w:val="1F2933"/>
-          <w:sz w:val="21"/>
-        </w:rPr>
-        <w:t xml:space="preserve">  </w:t>
-      </w:r>
-      <w:r>
-        <w:rPr>
-          <w:rFonts w:ascii="Calibri" w:hAnsi="Calibri" w:eastAsia="Calibri"/>
-          <w:color w:val="1F2933"/>
-          <w:sz w:val="21"/>
-        </w:rPr>
-        <w:t>Outside-provider referral</w:t>
-      </w:r>
-    </w:p>
-    <w:p>
-      <w:pPr>
-        <w:pStyle w:val="ResponseOption"/>
-      </w:pPr>
-      <w:r>
-        <w:rPr>
-          <w:rFonts w:ascii="Segoe UI Symbol" w:hAnsi="Segoe UI Symbol" w:eastAsia="Segoe UI Symbol"/>
-          <w:color w:val="1F2933"/>
-          <w:sz w:val="24"/>
-        </w:rPr>
-        <w:t>☐</w:t>
-      </w:r>
-      <w:r>
-        <w:rPr>
-          <w:rFonts w:ascii="Calibri" w:hAnsi="Calibri" w:eastAsia="Calibri"/>
-          <w:color w:val="1F2933"/>
-          <w:sz w:val="21"/>
-        </w:rPr>
-        <w:t xml:space="preserve">  </w:t>
-      </w:r>
-      <w:r>
-        <w:rPr>
-          <w:rFonts w:ascii="Calibri" w:hAnsi="Calibri" w:eastAsia="Calibri"/>
-          <w:color w:val="1F2933"/>
-          <w:sz w:val="21"/>
-        </w:rPr>
-        <w:t>Provider communication</w:t>
-      </w:r>
-    </w:p>
-    <w:p>
-      <w:pPr>
-        <w:pStyle w:val="ResponseOption"/>
-      </w:pPr>
-      <w:r>
-        <w:rPr>
-          <w:rFonts w:ascii="Segoe UI Symbol" w:hAnsi="Segoe UI Symbol" w:eastAsia="Segoe UI Symbol"/>
-          <w:color w:val="1F2933"/>
-          <w:sz w:val="24"/>
-        </w:rPr>
-        <w:t>☐</w:t>
-      </w:r>
-      <w:r>
-        <w:rPr>
-          <w:rFonts w:ascii="Calibri" w:hAnsi="Calibri" w:eastAsia="Calibri"/>
-          <w:color w:val="1F2933"/>
-          <w:sz w:val="21"/>
-        </w:rPr>
-        <w:t xml:space="preserve">  </w:t>
-      </w:r>
-      <w:r>
-        <w:rPr>
-          <w:rFonts w:ascii="Calibri" w:hAnsi="Calibri" w:eastAsia="Calibri"/>
-          <w:color w:val="1F2933"/>
-          <w:sz w:val="21"/>
-        </w:rPr>
-        <w:t>Attendance or behavior information</w:t>
-      </w:r>
-    </w:p>
-    <w:p>
-      <w:pPr>
-        <w:pStyle w:val="ResponseOption"/>
-      </w:pPr>
-      <w:r>
-        <w:rPr>
-          <w:rFonts w:ascii="Segoe UI Symbol" w:hAnsi="Segoe UI Symbol" w:eastAsia="Segoe UI Symbol"/>
-          <w:color w:val="1F2933"/>
-          <w:sz w:val="24"/>
-        </w:rPr>
-        <w:t>☐</w:t>
-      </w:r>
-      <w:r>
-        <w:rPr>
-          <w:rFonts w:ascii="Calibri" w:hAnsi="Calibri" w:eastAsia="Calibri"/>
-          <w:color w:val="1F2933"/>
-          <w:sz w:val="21"/>
-        </w:rPr>
-        <w:t xml:space="preserve">  </w:t>
-      </w:r>
-      <w:r>
-        <w:rPr>
-          <w:rFonts w:ascii="Calibri" w:hAnsi="Calibri" w:eastAsia="Calibri"/>
-          <w:color w:val="1F2933"/>
-          <w:sz w:val="21"/>
-        </w:rPr>
-        <w:t>Documentation still owed</w:t>
-      </w:r>
-    </w:p>
-    <w:p>
-      <w:pPr>
-        <w:pStyle w:val="ResponseOption"/>
-      </w:pPr>
-      <w:r>
-        <w:rPr>
-          <w:rFonts w:ascii="Segoe UI Symbol" w:hAnsi="Segoe UI Symbol" w:eastAsia="Segoe UI Symbol"/>
-          <w:color w:val="1F2933"/>
-          <w:sz w:val="24"/>
-        </w:rPr>
-        <w:t>☐</w:t>
-      </w:r>
-      <w:r>
-        <w:rPr>
-          <w:rFonts w:ascii="Calibri" w:hAnsi="Calibri" w:eastAsia="Calibri"/>
-          <w:color w:val="1F2933"/>
-          <w:sz w:val="21"/>
-        </w:rPr>
-        <w:t xml:space="preserve">  </w:t>
-      </w:r>
-      <w:r>
-        <w:rPr>
-          <w:rFonts w:ascii="Calibri" w:hAnsi="Calibri" w:eastAsia="Calibri"/>
-          <w:color w:val="1F2933"/>
-          <w:sz w:val="21"/>
-        </w:rPr>
-        <w:t>Waiting-list or eligibility decision</w:t>
-      </w:r>
-    </w:p>
-    <w:p>
-      <w:pPr>
-        <w:pStyle w:val="ResponseOption"/>
-      </w:pPr>
-      <w:r>
-        <w:rPr>
-          <w:rFonts w:ascii="Segoe UI Symbol" w:hAnsi="Segoe UI Symbol" w:eastAsia="Segoe UI Symbol"/>
-          <w:color w:val="1F2933"/>
-          <w:sz w:val="24"/>
-        </w:rPr>
-        <w:t>☐</w:t>
-      </w:r>
-      <w:r>
-        <w:rPr>
-          <w:rFonts w:ascii="Calibri" w:hAnsi="Calibri" w:eastAsia="Calibri"/>
-          <w:color w:val="1F2933"/>
-          <w:sz w:val="21"/>
-        </w:rPr>
-        <w:t xml:space="preserve">  </w:t>
-      </w:r>
-      <w:r>
-        <w:rPr>
-          <w:rFonts w:ascii="Calibri" w:hAnsi="Calibri" w:eastAsia="Calibri"/>
-          <w:color w:val="1F2933"/>
-          <w:sz w:val="21"/>
-        </w:rPr>
-        <w:t>Task assigned to another staff member</w:t>
-      </w:r>
-    </w:p>
-    <w:p>
-      <w:pPr>
-        <w:pStyle w:val="ResponseOption"/>
-      </w:pPr>
-      <w:r>
-        <w:rPr>
-          <w:rFonts w:ascii="Segoe UI Symbol" w:hAnsi="Segoe UI Symbol" w:eastAsia="Segoe UI Symbol"/>
-          <w:color w:val="1F2933"/>
-          <w:sz w:val="24"/>
-        </w:rPr>
-        <w:t>☐</w:t>
-      </w:r>
-      <w:r>
-        <w:rPr>
-          <w:rFonts w:ascii="Calibri" w:hAnsi="Calibri" w:eastAsia="Calibri"/>
-          <w:color w:val="1F2933"/>
-          <w:sz w:val="21"/>
-        </w:rPr>
-        <w:t xml:space="preserve">  </w:t>
-      </w:r>
-      <w:r>
-        <w:rPr>
-          <w:rFonts w:ascii="Calibri" w:hAnsi="Calibri" w:eastAsia="Calibri"/>
-          <w:color w:val="1F2933"/>
-          <w:sz w:val="21"/>
-        </w:rPr>
-        <w:t>Case transition, reassignment, or closure</w:t>
-      </w:r>
-    </w:p>
-    <w:p>
-      <w:pPr>
-        <w:pStyle w:val="ResponseOption"/>
-      </w:pPr>
-      <w:r>
-        <w:rPr>
-          <w:rFonts w:ascii="Segoe UI Symbol" w:hAnsi="Segoe UI Symbol" w:eastAsia="Segoe UI Symbol"/>
-          <w:color w:val="1F2933"/>
-          <w:sz w:val="24"/>
-        </w:rPr>
-        <w:t>☐</w:t>
-      </w:r>
-      <w:r>
-        <w:rPr>
-          <w:rFonts w:ascii="Calibri" w:hAnsi="Calibri" w:eastAsia="Calibri"/>
-          <w:color w:val="1F2933"/>
-          <w:sz w:val="21"/>
-        </w:rPr>
-        <w:t xml:space="preserve">  </w:t>
-      </w:r>
-      <w:r>
-        <w:rPr>
-          <w:rFonts w:ascii="Calibri" w:hAnsi="Calibri" w:eastAsia="Calibri"/>
-          <w:color w:val="1F2933"/>
-          <w:sz w:val="21"/>
-        </w:rPr>
-        <w:t>Other: ______________________________</w:t>
-      </w:r>
-    </w:p>
-    <w:p>
-      <w:pPr>
-        <w:keepNext/>
-        <w:numPr>
-          <w:ilvl w:val="0"/>
-          <w:numId w:val="10"/>
-        </w:numPr>
-        <w:pStyle w:val="Question"/>
-      </w:pPr>
-      <w:r>
-        <w:t>Which three loose ends are hardest to manage?</w:t>
-      </w:r>
-    </w:p>
-    <w:p>
-      <w:pPr>
-        <w:pStyle w:val="Instruction"/>
-        <w:spacing w:before="20"/>
-      </w:pPr>
-      <w:r>
-        <w:rPr>
-          <w:rFonts w:ascii="Calibri" w:hAnsi="Calibri" w:eastAsia="Calibri"/>
-          <w:i/>
-          <w:color w:val="5D6A73"/>
-          <w:sz w:val="19"/>
-        </w:rPr>
-        <w:t>List your top three in order.</w:t>
-      </w:r>
-    </w:p>
-    <w:p>
-      <w:pPr>
-        <w:pStyle w:val="ResponseLine"/>
-        <w:pBdr>
-          <w:bottom w:val="single" w:sz="6" w:space="2" w:color="C9D5DF"/>
-        </w:pBdr>
-      </w:pPr>
-      <w:r>
-        <w:t xml:space="preserve"> </w:t>
-      </w:r>
-    </w:p>
-    <w:p>
-      <w:pPr>
-        <w:pStyle w:val="ResponseLine"/>
-        <w:pBdr>
-          <w:bottom w:val="single" w:sz="6" w:space="2" w:color="C9D5DF"/>
-        </w:pBdr>
-      </w:pPr>
-      <w:r>
-        <w:t xml:space="preserve"> </w:t>
-      </w:r>
-    </w:p>
-    <w:p>
-      <w:pPr>
-        <w:pStyle w:val="ResponseLine"/>
-        <w:pBdr>
-          <w:bottom w:val="single" w:sz="6" w:space="2" w:color="C9D5DF"/>
-        </w:pBdr>
-      </w:pPr>
-      <w:r>
-        <w:t xml:space="preserve"> </w:t>
-      </w:r>
-    </w:p>
-    <w:p>
-      <w:pPr>
-        <w:keepNext/>
-        <w:numPr>
-          <w:ilvl w:val="0"/>
-          <w:numId w:val="10"/>
-        </w:numPr>
-        <w:pStyle w:val="Question"/>
-      </w:pPr>
-      <w:r>
-        <w:t>Where do you currently record these follow-ups?</w:t>
-      </w:r>
-    </w:p>
-    <w:p>
-      <w:pPr>
-        <w:pStyle w:val="ResponseLine"/>
-        <w:pBdr>
-          <w:bottom w:val="single" w:sz="6" w:space="2" w:color="C9D5DF"/>
-        </w:pBdr>
-      </w:pPr>
-      <w:r>
-        <w:t xml:space="preserve"> </w:t>
-      </w:r>
-    </w:p>
-    <w:p>
-      <w:pPr>
-        <w:pStyle w:val="ResponseLine"/>
-        <w:pBdr>
-          <w:bottom w:val="single" w:sz="6" w:space="2" w:color="C9D5DF"/>
-        </w:pBdr>
-      </w:pPr>
-      <w:r>
-        <w:t xml:space="preserve"> </w:t>
-      </w:r>
-    </w:p>
-    <w:p>
-      <w:pPr>
-        <w:keepNext/>
-        <w:numPr>
-          <w:ilvl w:val="0"/>
-          <w:numId w:val="10"/>
-        </w:numPr>
-        <w:pStyle w:val="Question"/>
-      </w:pPr>
-      <w:r>
-        <w:t>How do you know when a follow-up, intervention, or referral is complete?</w:t>
-      </w:r>
-    </w:p>
-    <w:p>
-      <w:pPr>
-        <w:pStyle w:val="ResponseLine"/>
-        <w:pBdr>
-          <w:bottom w:val="single" w:sz="6" w:space="2" w:color="C9D5DF"/>
-        </w:pBdr>
-      </w:pPr>
-      <w:r>
-        <w:t xml:space="preserve"> </w:t>
-      </w:r>
-    </w:p>
-    <w:p>
-      <w:pPr>
-        <w:pStyle w:val="ResponseLine"/>
-        <w:pBdr>
-          <w:bottom w:val="single" w:sz="6" w:space="2" w:color="C9D5DF"/>
-        </w:pBdr>
-      </w:pPr>
-      <w:r>
-        <w:t xml:space="preserve"> </w:t>
-      </w:r>
-    </w:p>
-    <w:p>
-      <w:pPr>
-        <w:keepNext/>
-        <w:numPr>
-          <w:ilvl w:val="0"/>
-          <w:numId w:val="10"/>
-        </w:numPr>
-        <w:pStyle w:val="Question"/>
-      </w:pPr>
-      <w:r>
-        <w:t>Without sharing identifying details, describe a time when an important follow-up was delayed, missed, or difficult to reconstruct.</w:t>
-      </w:r>
-    </w:p>
-    <w:p>
-      <w:pPr>
-        <w:pStyle w:val="ResponseLine"/>
-        <w:pBdr>
-          <w:bottom w:val="single" w:sz="6" w:space="2" w:color="C9D5DF"/>
-        </w:pBdr>
-      </w:pPr>
-      <w:r>
-        <w:t xml:space="preserve"> </w:t>
-      </w:r>
-    </w:p>
-    <w:p>
-      <w:pPr>
-        <w:pStyle w:val="ResponseLine"/>
-        <w:pBdr>
-          <w:bottom w:val="single" w:sz="6" w:space="2" w:color="C9D5DF"/>
-        </w:pBdr>
-      </w:pPr>
-      <w:r>
-        <w:t xml:space="preserve"> </w:t>
-      </w:r>
-    </w:p>
-    <w:p>
-      <w:pPr>
-        <w:pStyle w:val="ResponseLine"/>
-        <w:pBdr>
-          <w:bottom w:val="single" w:sz="6" w:space="2" w:color="C9D5DF"/>
-        </w:pBdr>
-      </w:pPr>
-      <w:r>
-        <w:t xml:space="preserve"> </w:t>
-      </w:r>
-    </w:p>
-    <w:p>
-      <w:pPr>
-        <w:pStyle w:val="Heading1"/>
-        <w:keepNext/>
-      </w:pPr>
-      <w:r>
-        <w:t>4. Meetings, interventions, and referrals</w:t>
-      </w:r>
-    </w:p>
-    <w:p>
-      <w:pPr>
-        <w:keepNext/>
-        <w:numPr>
-          <w:ilvl w:val="0"/>
-          <w:numId w:val="10"/>
-        </w:numPr>
-        <w:pStyle w:val="Question"/>
-      </w:pPr>
-      <w:r>
-        <w:t>What information do you usually need before a student-support meeting?</w:t>
-      </w:r>
-    </w:p>
-    <w:p>
-      <w:pPr>
-        <w:pStyle w:val="ResponseLine"/>
-        <w:pBdr>
-          <w:bottom w:val="single" w:sz="6" w:space="2" w:color="C9D5DF"/>
-        </w:pBdr>
-      </w:pPr>
-      <w:r>
-        <w:t xml:space="preserve"> </w:t>
-      </w:r>
-    </w:p>
-    <w:p>
-      <w:pPr>
-        <w:pStyle w:val="ResponseLine"/>
-        <w:pBdr>
-          <w:bottom w:val="single" w:sz="6" w:space="2" w:color="C9D5DF"/>
-        </w:pBdr>
-      </w:pPr>
-      <w:r>
-        <w:t xml:space="preserve"> </w:t>
-      </w:r>
-    </w:p>
-    <w:p>
-      <w:pPr>
-        <w:keepNext/>
-        <w:numPr>
-          <w:ilvl w:val="0"/>
-          <w:numId w:val="10"/>
-        </w:numPr>
-        <w:pStyle w:val="Question"/>
-      </w:pPr>
-      <w:r>
-        <w:t>What is most time-consuming about preparing for those meetings?</w:t>
-      </w:r>
-    </w:p>
-    <w:p>
-      <w:pPr>
-        <w:pStyle w:val="ResponseLine"/>
-        <w:pBdr>
-          <w:bottom w:val="single" w:sz="6" w:space="2" w:color="C9D5DF"/>
-        </w:pBdr>
-      </w:pPr>
-      <w:r>
-        <w:t xml:space="preserve"> </w:t>
-      </w:r>
-    </w:p>
-    <w:p>
-      <w:pPr>
-        <w:pStyle w:val="ResponseLine"/>
-        <w:pBdr>
-          <w:bottom w:val="single" w:sz="6" w:space="2" w:color="C9D5DF"/>
-        </w:pBdr>
-      </w:pPr>
-      <w:r>
-        <w:t xml:space="preserve"> </w:t>
-      </w:r>
-    </w:p>
-    <w:p>
-      <w:pPr>
-        <w:keepNext/>
-        <w:numPr>
-          <w:ilvl w:val="0"/>
-          <w:numId w:val="10"/>
-        </w:numPr>
-        <w:pStyle w:val="Question"/>
-      </w:pPr>
-      <w:r>
-        <w:t>How are meeting decisions, owners, and resulting action items recorded today?</w:t>
-      </w:r>
-    </w:p>
-    <w:p>
-      <w:pPr>
-        <w:pStyle w:val="ResponseLine"/>
-        <w:pBdr>
-          <w:bottom w:val="single" w:sz="6" w:space="2" w:color="C9D5DF"/>
-        </w:pBdr>
-      </w:pPr>
-      <w:r>
-        <w:t xml:space="preserve"> </w:t>
-      </w:r>
-    </w:p>
-    <w:p>
-      <w:pPr>
-        <w:pStyle w:val="ResponseLine"/>
-        <w:pBdr>
-          <w:bottom w:val="single" w:sz="6" w:space="2" w:color="C9D5DF"/>
-        </w:pBdr>
-      </w:pPr>
-      <w:r>
-        <w:t xml:space="preserve"> </w:t>
-      </w:r>
-    </w:p>
-    <w:p>
-      <w:pPr>
-        <w:keepNext/>
-        <w:numPr>
-          <w:ilvl w:val="0"/>
-          <w:numId w:val="10"/>
-        </w:numPr>
-        <w:pStyle w:val="Question"/>
-      </w:pPr>
-      <w:r>
-        <w:t>What makes intervention reviews or referrals difficult to track through completion?</w:t>
-      </w:r>
-    </w:p>
-    <w:p>
-      <w:pPr>
-        <w:pStyle w:val="ResponseLine"/>
-        <w:pBdr>
-          <w:bottom w:val="single" w:sz="6" w:space="2" w:color="C9D5DF"/>
-        </w:pBdr>
-      </w:pPr>
-      <w:r>
-        <w:t xml:space="preserve"> </w:t>
-      </w:r>
-    </w:p>
-    <w:p>
-      <w:pPr>
-        <w:pStyle w:val="ResponseLine"/>
-        <w:pBdr>
-          <w:bottom w:val="single" w:sz="6" w:space="2" w:color="C9D5DF"/>
-        </w:pBdr>
-      </w:pPr>
-      <w:r>
-        <w:t xml:space="preserve"> </w:t>
-      </w:r>
-    </w:p>
-    <w:p>
-      <w:pPr>
-        <w:pStyle w:val="Heading1"/>
-        <w:keepNext/>
-      </w:pPr>
-      <w:r>
-        <w:t>5. Attention and reminders</w:t>
-      </w:r>
-    </w:p>
-    <w:p>
-      <w:pPr>
-        <w:keepNext/>
-        <w:numPr>
-          <w:ilvl w:val="0"/>
-          <w:numId w:val="10"/>
-        </w:numPr>
-        <w:pStyle w:val="Question"/>
-      </w:pPr>
-      <w:r>
-        <w:t>What information would be most useful in a daily view of items needing attention? Select up to five.</w:t>
-      </w:r>
-    </w:p>
-    <w:p>
-      <w:pPr>
-        <w:pStyle w:val="ResponseOption"/>
-      </w:pPr>
-      <w:r>
-        <w:rPr>
-          <w:rFonts w:ascii="Segoe UI Symbol" w:hAnsi="Segoe UI Symbol" w:eastAsia="Segoe UI Symbol"/>
-          <w:color w:val="1F2933"/>
-          <w:sz w:val="24"/>
-        </w:rPr>
-        <w:t>☐</w:t>
-      </w:r>
-      <w:r>
-        <w:rPr>
-          <w:rFonts w:ascii="Calibri" w:hAnsi="Calibri" w:eastAsia="Calibri"/>
-          <w:color w:val="1F2933"/>
-          <w:sz w:val="21"/>
-        </w:rPr>
-        <w:t xml:space="preserve">  </w:t>
-      </w:r>
-      <w:r>
-        <w:rPr>
-          <w:rFonts w:ascii="Calibri" w:hAnsi="Calibri" w:eastAsia="Calibri"/>
-          <w:color w:val="1F2933"/>
-          <w:sz w:val="21"/>
-        </w:rPr>
-        <w:t>Overdue follow-ups</w:t>
-      </w:r>
-    </w:p>
-    <w:p>
-      <w:pPr>
-        <w:pStyle w:val="ResponseOption"/>
-      </w:pPr>
-      <w:r>
-        <w:rPr>
-          <w:rFonts w:ascii="Segoe UI Symbol" w:hAnsi="Segoe UI Symbol" w:eastAsia="Segoe UI Symbol"/>
-          <w:color w:val="1F2933"/>
-          <w:sz w:val="24"/>
-        </w:rPr>
-        <w:t>☐</w:t>
-      </w:r>
-      <w:r>
-        <w:rPr>
-          <w:rFonts w:ascii="Calibri" w:hAnsi="Calibri" w:eastAsia="Calibri"/>
-          <w:color w:val="1F2933"/>
-          <w:sz w:val="21"/>
-        </w:rPr>
-        <w:t xml:space="preserve">  </w:t>
-      </w:r>
-      <w:r>
-        <w:rPr>
-          <w:rFonts w:ascii="Calibri" w:hAnsi="Calibri" w:eastAsia="Calibri"/>
-          <w:color w:val="1F2933"/>
-          <w:sz w:val="21"/>
-        </w:rPr>
-        <w:t>Follow-ups due soon</w:t>
-      </w:r>
-    </w:p>
-    <w:p>
-      <w:pPr>
-        <w:pStyle w:val="ResponseOption"/>
-      </w:pPr>
-      <w:r>
-        <w:rPr>
-          <w:rFonts w:ascii="Segoe UI Symbol" w:hAnsi="Segoe UI Symbol" w:eastAsia="Segoe UI Symbol"/>
-          <w:color w:val="1F2933"/>
-          <w:sz w:val="24"/>
-        </w:rPr>
-        <w:t>☐</w:t>
-      </w:r>
-      <w:r>
-        <w:rPr>
-          <w:rFonts w:ascii="Calibri" w:hAnsi="Calibri" w:eastAsia="Calibri"/>
-          <w:color w:val="1F2933"/>
-          <w:sz w:val="21"/>
-        </w:rPr>
-        <w:t xml:space="preserve">  </w:t>
-      </w:r>
-      <w:r>
-        <w:rPr>
-          <w:rFonts w:ascii="Calibri" w:hAnsi="Calibri" w:eastAsia="Calibri"/>
-          <w:color w:val="1F2933"/>
-          <w:sz w:val="21"/>
-        </w:rPr>
-        <w:t>Items waiting on another person</w:t>
-      </w:r>
-    </w:p>
-    <w:p>
-      <w:pPr>
-        <w:pStyle w:val="ResponseOption"/>
-      </w:pPr>
-      <w:r>
-        <w:rPr>
-          <w:rFonts w:ascii="Segoe UI Symbol" w:hAnsi="Segoe UI Symbol" w:eastAsia="Segoe UI Symbol"/>
-          <w:color w:val="1F2933"/>
-          <w:sz w:val="24"/>
-        </w:rPr>
-        <w:t>☐</w:t>
-      </w:r>
-      <w:r>
-        <w:rPr>
-          <w:rFonts w:ascii="Calibri" w:hAnsi="Calibri" w:eastAsia="Calibri"/>
-          <w:color w:val="1F2933"/>
-          <w:sz w:val="21"/>
-        </w:rPr>
-        <w:t xml:space="preserve">  </w:t>
-      </w:r>
-      <w:r>
-        <w:rPr>
-          <w:rFonts w:ascii="Calibri" w:hAnsi="Calibri" w:eastAsia="Calibri"/>
-          <w:color w:val="1F2933"/>
-          <w:sz w:val="21"/>
-        </w:rPr>
-        <w:t>Upcoming meetings</w:t>
-      </w:r>
-    </w:p>
-    <w:p>
-      <w:pPr>
-        <w:pStyle w:val="ResponseOption"/>
-      </w:pPr>
-      <w:r>
-        <w:rPr>
-          <w:rFonts w:ascii="Segoe UI Symbol" w:hAnsi="Segoe UI Symbol" w:eastAsia="Segoe UI Symbol"/>
-          <w:color w:val="1F2933"/>
-          <w:sz w:val="24"/>
-        </w:rPr>
-        <w:t>☐</w:t>
-      </w:r>
-      <w:r>
-        <w:rPr>
-          <w:rFonts w:ascii="Calibri" w:hAnsi="Calibri" w:eastAsia="Calibri"/>
-          <w:color w:val="1F2933"/>
-          <w:sz w:val="21"/>
-        </w:rPr>
-        <w:t xml:space="preserve">  </w:t>
-      </w:r>
-      <w:r>
-        <w:rPr>
-          <w:rFonts w:ascii="Calibri" w:hAnsi="Calibri" w:eastAsia="Calibri"/>
-          <w:color w:val="1F2933"/>
-          <w:sz w:val="21"/>
-        </w:rPr>
-        <w:t>Meeting preparation still needed</w:t>
-      </w:r>
-    </w:p>
-    <w:p>
-      <w:pPr>
-        <w:pStyle w:val="ResponseOption"/>
-      </w:pPr>
-      <w:r>
-        <w:rPr>
-          <w:rFonts w:ascii="Segoe UI Symbol" w:hAnsi="Segoe UI Symbol" w:eastAsia="Segoe UI Symbol"/>
-          <w:color w:val="1F2933"/>
-          <w:sz w:val="24"/>
-        </w:rPr>
-        <w:t>☐</w:t>
-      </w:r>
-      <w:r>
-        <w:rPr>
-          <w:rFonts w:ascii="Calibri" w:hAnsi="Calibri" w:eastAsia="Calibri"/>
-          <w:color w:val="1F2933"/>
-          <w:sz w:val="21"/>
-        </w:rPr>
-        <w:t xml:space="preserve">  </w:t>
-      </w:r>
-      <w:r>
-        <w:rPr>
-          <w:rFonts w:ascii="Calibri" w:hAnsi="Calibri" w:eastAsia="Calibri"/>
-          <w:color w:val="1F2933"/>
-          <w:sz w:val="21"/>
-        </w:rPr>
-        <w:t>Interventions due for review</w:t>
-      </w:r>
-    </w:p>
-    <w:p>
-      <w:pPr>
-        <w:pStyle w:val="ResponseOption"/>
-      </w:pPr>
-      <w:r>
-        <w:rPr>
-          <w:rFonts w:ascii="Segoe UI Symbol" w:hAnsi="Segoe UI Symbol" w:eastAsia="Segoe UI Symbol"/>
-          <w:color w:val="1F2933"/>
-          <w:sz w:val="24"/>
-        </w:rPr>
-        <w:t>☐</w:t>
-      </w:r>
-      <w:r>
-        <w:rPr>
-          <w:rFonts w:ascii="Calibri" w:hAnsi="Calibri" w:eastAsia="Calibri"/>
-          <w:color w:val="1F2933"/>
-          <w:sz w:val="21"/>
-        </w:rPr>
-        <w:t xml:space="preserve">  </w:t>
-      </w:r>
-      <w:r>
-        <w:rPr>
-          <w:rFonts w:ascii="Calibri" w:hAnsi="Calibri" w:eastAsia="Calibri"/>
-          <w:color w:val="1F2933"/>
-          <w:sz w:val="21"/>
-        </w:rPr>
-        <w:t>Referrals with no recent update</w:t>
-      </w:r>
-    </w:p>
-    <w:p>
-      <w:pPr>
-        <w:pStyle w:val="ResponseOption"/>
-      </w:pPr>
-      <w:r>
-        <w:rPr>
-          <w:rFonts w:ascii="Segoe UI Symbol" w:hAnsi="Segoe UI Symbol" w:eastAsia="Segoe UI Symbol"/>
-          <w:color w:val="1F2933"/>
-          <w:sz w:val="24"/>
-        </w:rPr>
-        <w:t>☐</w:t>
-      </w:r>
-      <w:r>
-        <w:rPr>
-          <w:rFonts w:ascii="Calibri" w:hAnsi="Calibri" w:eastAsia="Calibri"/>
-          <w:color w:val="1F2933"/>
-          <w:sz w:val="21"/>
-        </w:rPr>
-        <w:t xml:space="preserve">  </w:t>
-      </w:r>
-      <w:r>
-        <w:rPr>
-          <w:rFonts w:ascii="Calibri" w:hAnsi="Calibri" w:eastAsia="Calibri"/>
-          <w:color w:val="1F2933"/>
-          <w:sz w:val="21"/>
-        </w:rPr>
-        <w:t>Recently changed student information</w:t>
-      </w:r>
-    </w:p>
-    <w:p>
-      <w:pPr>
-        <w:pStyle w:val="ResponseOption"/>
-      </w:pPr>
-      <w:r>
-        <w:rPr>
-          <w:rFonts w:ascii="Segoe UI Symbol" w:hAnsi="Segoe UI Symbol" w:eastAsia="Segoe UI Symbol"/>
-          <w:color w:val="1F2933"/>
-          <w:sz w:val="24"/>
-        </w:rPr>
-        <w:t>☐</w:t>
-      </w:r>
-      <w:r>
-        <w:rPr>
-          <w:rFonts w:ascii="Calibri" w:hAnsi="Calibri" w:eastAsia="Calibri"/>
-          <w:color w:val="1F2933"/>
-          <w:sz w:val="21"/>
-        </w:rPr>
-        <w:t xml:space="preserve">  </w:t>
-      </w:r>
-      <w:r>
-        <w:rPr>
-          <w:rFonts w:ascii="Calibri" w:hAnsi="Calibri" w:eastAsia="Calibri"/>
-          <w:color w:val="1F2933"/>
-          <w:sz w:val="21"/>
-        </w:rPr>
-        <w:t>Unfinished documentation</w:t>
-      </w:r>
-    </w:p>
-    <w:p>
-      <w:pPr>
-        <w:pStyle w:val="ResponseOption"/>
-      </w:pPr>
-      <w:r>
-        <w:rPr>
-          <w:rFonts w:ascii="Segoe UI Symbol" w:hAnsi="Segoe UI Symbol" w:eastAsia="Segoe UI Symbol"/>
-          <w:color w:val="1F2933"/>
-          <w:sz w:val="24"/>
-        </w:rPr>
-        <w:t>☐</w:t>
-      </w:r>
-      <w:r>
-        <w:rPr>
-          <w:rFonts w:ascii="Calibri" w:hAnsi="Calibri" w:eastAsia="Calibri"/>
-          <w:color w:val="1F2933"/>
-          <w:sz w:val="21"/>
-        </w:rPr>
-        <w:t xml:space="preserve">  </w:t>
-      </w:r>
-      <w:r>
-        <w:rPr>
-          <w:rFonts w:ascii="Calibri" w:hAnsi="Calibri" w:eastAsia="Calibri"/>
-          <w:color w:val="1F2933"/>
-          <w:sz w:val="21"/>
-        </w:rPr>
-        <w:t>Unassigned action items</w:t>
-      </w:r>
-    </w:p>
-    <w:p>
-      <w:pPr>
-        <w:pStyle w:val="ResponseOption"/>
-      </w:pPr>
-      <w:r>
-        <w:rPr>
-          <w:rFonts w:ascii="Segoe UI Symbol" w:hAnsi="Segoe UI Symbol" w:eastAsia="Segoe UI Symbol"/>
-          <w:color w:val="1F2933"/>
-          <w:sz w:val="24"/>
-        </w:rPr>
-        <w:t>☐</w:t>
-      </w:r>
-      <w:r>
-        <w:rPr>
-          <w:rFonts w:ascii="Calibri" w:hAnsi="Calibri" w:eastAsia="Calibri"/>
-          <w:color w:val="1F2933"/>
-          <w:sz w:val="21"/>
-        </w:rPr>
-        <w:t xml:space="preserve">  </w:t>
-      </w:r>
-      <w:r>
-        <w:rPr>
-          <w:rFonts w:ascii="Calibri" w:hAnsi="Calibri" w:eastAsia="Calibri"/>
-          <w:color w:val="1F2933"/>
-          <w:sz w:val="21"/>
-        </w:rPr>
-        <w:t>Other: ______________________________</w:t>
-      </w:r>
-    </w:p>
-    <w:p>
-      <w:pPr>
-        <w:keepNext/>
-        <w:numPr>
-          <w:ilvl w:val="0"/>
-          <w:numId w:val="10"/>
-        </w:numPr>
-        <w:pStyle w:val="Question"/>
-      </w:pPr>
-      <w:r>
-        <w:t>What types of reminders or alerts would feel noisy, intrusive, or inappropriate?</w:t>
-      </w:r>
-    </w:p>
-    <w:p>
-      <w:pPr>
-        <w:pStyle w:val="ResponseLine"/>
-        <w:pBdr>
-          <w:bottom w:val="single" w:sz="6" w:space="2" w:color="C9D5DF"/>
-        </w:pBdr>
-      </w:pPr>
-      <w:r>
-        <w:t xml:space="preserve"> </w:t>
-      </w:r>
-    </w:p>
-    <w:p>
-      <w:pPr>
-        <w:pStyle w:val="ResponseLine"/>
-        <w:pBdr>
-          <w:bottom w:val="single" w:sz="6" w:space="2" w:color="C9D5DF"/>
-        </w:pBdr>
-      </w:pPr>
-      <w:r>
-        <w:t xml:space="preserve"> </w:t>
-      </w:r>
-    </w:p>
-    <w:p>
-      <w:pPr>
-        <w:keepNext/>
-        <w:numPr>
-          <w:ilvl w:val="0"/>
-          <w:numId w:val="10"/>
-        </w:numPr>
-        <w:pStyle w:val="Question"/>
-      </w:pPr>
-      <w:r>
-        <w:t>Which actions should a clinician be able to take directly from a reminder?</w:t>
-      </w:r>
-    </w:p>
-    <w:p>
-      <w:pPr>
-        <w:pStyle w:val="ResponseOption"/>
-      </w:pPr>
-      <w:r>
-        <w:rPr>
-          <w:rFonts w:ascii="Segoe UI Symbol" w:hAnsi="Segoe UI Symbol" w:eastAsia="Segoe UI Symbol"/>
-          <w:color w:val="1F2933"/>
-          <w:sz w:val="24"/>
-        </w:rPr>
-        <w:t>☐</w:t>
-      </w:r>
-      <w:r>
-        <w:rPr>
-          <w:rFonts w:ascii="Calibri" w:hAnsi="Calibri" w:eastAsia="Calibri"/>
-          <w:color w:val="1F2933"/>
-          <w:sz w:val="21"/>
-        </w:rPr>
-        <w:t xml:space="preserve">  </w:t>
-      </w:r>
-      <w:r>
-        <w:rPr>
-          <w:rFonts w:ascii="Calibri" w:hAnsi="Calibri" w:eastAsia="Calibri"/>
-          <w:color w:val="1F2933"/>
-          <w:sz w:val="21"/>
-        </w:rPr>
-        <w:t>Mark complete</w:t>
-      </w:r>
-    </w:p>
-    <w:p>
-      <w:pPr>
-        <w:pStyle w:val="ResponseOption"/>
-      </w:pPr>
-      <w:r>
-        <w:rPr>
-          <w:rFonts w:ascii="Segoe UI Symbol" w:hAnsi="Segoe UI Symbol" w:eastAsia="Segoe UI Symbol"/>
-          <w:color w:val="1F2933"/>
-          <w:sz w:val="24"/>
-        </w:rPr>
-        <w:t>☐</w:t>
-      </w:r>
-      <w:r>
-        <w:rPr>
-          <w:rFonts w:ascii="Calibri" w:hAnsi="Calibri" w:eastAsia="Calibri"/>
-          <w:color w:val="1F2933"/>
-          <w:sz w:val="21"/>
-        </w:rPr>
-        <w:t xml:space="preserve">  </w:t>
-      </w:r>
-      <w:r>
-        <w:rPr>
-          <w:rFonts w:ascii="Calibri" w:hAnsi="Calibri" w:eastAsia="Calibri"/>
-          <w:color w:val="1F2933"/>
-          <w:sz w:val="21"/>
-        </w:rPr>
-        <w:t>Record an outcome</w:t>
-      </w:r>
-    </w:p>
-    <w:p>
-      <w:pPr>
-        <w:pStyle w:val="ResponseOption"/>
-      </w:pPr>
-      <w:r>
-        <w:rPr>
-          <w:rFonts w:ascii="Segoe UI Symbol" w:hAnsi="Segoe UI Symbol" w:eastAsia="Segoe UI Symbol"/>
-          <w:color w:val="1F2933"/>
-          <w:sz w:val="24"/>
-        </w:rPr>
-        <w:t>☐</w:t>
-      </w:r>
-      <w:r>
-        <w:rPr>
-          <w:rFonts w:ascii="Calibri" w:hAnsi="Calibri" w:eastAsia="Calibri"/>
-          <w:color w:val="1F2933"/>
-          <w:sz w:val="21"/>
-        </w:rPr>
-        <w:t xml:space="preserve">  </w:t>
-      </w:r>
-      <w:r>
-        <w:rPr>
-          <w:rFonts w:ascii="Calibri" w:hAnsi="Calibri" w:eastAsia="Calibri"/>
-          <w:color w:val="1F2933"/>
-          <w:sz w:val="21"/>
-        </w:rPr>
-        <w:t>Reschedule</w:t>
-      </w:r>
-    </w:p>
-    <w:p>
-      <w:pPr>
-        <w:pStyle w:val="ResponseOption"/>
-      </w:pPr>
-      <w:r>
-        <w:rPr>
-          <w:rFonts w:ascii="Segoe UI Symbol" w:hAnsi="Segoe UI Symbol" w:eastAsia="Segoe UI Symbol"/>
-          <w:color w:val="1F2933"/>
-          <w:sz w:val="24"/>
-        </w:rPr>
-        <w:t>☐</w:t>
-      </w:r>
-      <w:r>
-        <w:rPr>
-          <w:rFonts w:ascii="Calibri" w:hAnsi="Calibri" w:eastAsia="Calibri"/>
-          <w:color w:val="1F2933"/>
-          <w:sz w:val="21"/>
-        </w:rPr>
-        <w:t xml:space="preserve">  </w:t>
-      </w:r>
-      <w:r>
-        <w:rPr>
-          <w:rFonts w:ascii="Calibri" w:hAnsi="Calibri" w:eastAsia="Calibri"/>
-          <w:color w:val="1F2933"/>
-          <w:sz w:val="21"/>
-        </w:rPr>
-        <w:t>Mark as waiting on someone</w:t>
-      </w:r>
-    </w:p>
-    <w:p>
-      <w:pPr>
-        <w:pStyle w:val="ResponseOption"/>
-      </w:pPr>
-      <w:r>
-        <w:rPr>
-          <w:rFonts w:ascii="Segoe UI Symbol" w:hAnsi="Segoe UI Symbol" w:eastAsia="Segoe UI Symbol"/>
-          <w:color w:val="1F2933"/>
-          <w:sz w:val="24"/>
-        </w:rPr>
-        <w:t>☐</w:t>
-      </w:r>
-      <w:r>
-        <w:rPr>
-          <w:rFonts w:ascii="Calibri" w:hAnsi="Calibri" w:eastAsia="Calibri"/>
-          <w:color w:val="1F2933"/>
-          <w:sz w:val="21"/>
-        </w:rPr>
-        <w:t xml:space="preserve">  </w:t>
-      </w:r>
-      <w:r>
-        <w:rPr>
-          <w:rFonts w:ascii="Calibri" w:hAnsi="Calibri" w:eastAsia="Calibri"/>
-          <w:color w:val="1F2933"/>
-          <w:sz w:val="21"/>
-        </w:rPr>
-        <w:t>Assign or delegate</w:t>
-      </w:r>
-    </w:p>
-    <w:p>
-      <w:pPr>
-        <w:pStyle w:val="ResponseOption"/>
-      </w:pPr>
-      <w:r>
-        <w:rPr>
-          <w:rFonts w:ascii="Segoe UI Symbol" w:hAnsi="Segoe UI Symbol" w:eastAsia="Segoe UI Symbol"/>
-          <w:color w:val="1F2933"/>
-          <w:sz w:val="24"/>
-        </w:rPr>
-        <w:t>☐</w:t>
-      </w:r>
-      <w:r>
-        <w:rPr>
-          <w:rFonts w:ascii="Calibri" w:hAnsi="Calibri" w:eastAsia="Calibri"/>
-          <w:color w:val="1F2933"/>
-          <w:sz w:val="21"/>
-        </w:rPr>
-        <w:t xml:space="preserve">  </w:t>
-      </w:r>
-      <w:r>
-        <w:rPr>
-          <w:rFonts w:ascii="Calibri" w:hAnsi="Calibri" w:eastAsia="Calibri"/>
-          <w:color w:val="1F2933"/>
-          <w:sz w:val="21"/>
-        </w:rPr>
-        <w:t>Dismiss with a reason</w:t>
-      </w:r>
-    </w:p>
-    <w:p>
-      <w:pPr>
-        <w:pStyle w:val="ResponseOption"/>
-      </w:pPr>
-      <w:r>
-        <w:rPr>
-          <w:rFonts w:ascii="Segoe UI Symbol" w:hAnsi="Segoe UI Symbol" w:eastAsia="Segoe UI Symbol"/>
-          <w:color w:val="1F2933"/>
-          <w:sz w:val="24"/>
-        </w:rPr>
-        <w:t>☐</w:t>
-      </w:r>
-      <w:r>
-        <w:rPr>
-          <w:rFonts w:ascii="Calibri" w:hAnsi="Calibri" w:eastAsia="Calibri"/>
-          <w:color w:val="1F2933"/>
-          <w:sz w:val="21"/>
-        </w:rPr>
-        <w:t xml:space="preserve">  </w:t>
-      </w:r>
-      <w:r>
-        <w:rPr>
-          <w:rFonts w:ascii="Calibri" w:hAnsi="Calibri" w:eastAsia="Calibri"/>
-          <w:color w:val="1F2933"/>
-          <w:sz w:val="21"/>
-        </w:rPr>
-        <w:t>Open the student’s history</w:t>
+        <w:t>Memory</w:t>
       </w:r>
     </w:p>
     <w:p>
@@ -3260,24 +1013,10 @@
     <w:p>
       <w:pPr>
         <w:pStyle w:val="Heading1"/>
-        <w:keepNext/>
+        <w:pageBreakBefore/>
       </w:pPr>
       <w:r>
-        <w:t>6. AI-assisted features and trust</w:t>
-      </w:r>
-    </w:p>
-    <w:p>
-      <w:pPr>
-        <w:spacing w:after="160"/>
-      </w:pPr>
-      <w:r>
-        <w:rPr>
-          <w:rFonts w:ascii="Calibri" w:hAnsi="Calibri" w:eastAsia="Calibri"/>
-          <w:i/>
-          <w:color w:val="5D6A73"/>
-          <w:sz w:val="20"/>
-        </w:rPr>
-        <w:t>CasePilot may use AI to propose structured information from clinician-entered notes or summarize available history. AI would not diagnose students, determine treatment, or silently change a case record.</w:t>
+        <w:t>Highest-value product decisions</w:t>
       </w:r>
     </w:p>
     <w:p>
@@ -3290,7 +1029,7 @@
         <w:pStyle w:val="Question"/>
       </w:pPr>
       <w:r>
-        <w:t>Which AI-assisted tasks could be useful? Select all that apply.</w:t>
+        <w:t>How long does it usually take to gather the context you need before a student meeting or follow-up?</w:t>
       </w:r>
     </w:p>
     <w:p>
@@ -3319,7 +1058,7 @@
           <w:color w:val="1F2933"/>
           <w:sz w:val="21"/>
         </w:rPr>
-        <w:t>Propose follow-ups from a note</w:t>
+        <w:t>Less than 5 minutes</w:t>
       </w:r>
     </w:p>
     <w:p>
@@ -3348,7 +1087,7 @@
           <w:color w:val="1F2933"/>
           <w:sz w:val="21"/>
         </w:rPr>
-        <w:t>Propose an owner or review date for confirmation</w:t>
+        <w:t>5–15 minutes</w:t>
       </w:r>
     </w:p>
     <w:p>
@@ -3377,7 +1116,7 @@
           <w:color w:val="1F2933"/>
           <w:sz w:val="21"/>
         </w:rPr>
-        <w:t>Organize a student timeline</w:t>
+        <w:t>16–30 minutes</w:t>
       </w:r>
     </w:p>
     <w:p>
@@ -3406,152 +1145,7 @@
           <w:color w:val="1F2933"/>
           <w:sz w:val="21"/>
         </w:rPr>
-        <w:t>Summarize recent changes</w:t>
-      </w:r>
-    </w:p>
-    <w:p>
-      <w:pPr>
-        <w:pStyle w:val="ResponseOption"/>
-      </w:pPr>
-      <w:r>
-        <w:rPr>
-          <w:rFonts w:ascii="Segoe UI Symbol" w:hAnsi="Segoe UI Symbol" w:eastAsia="Segoe UI Symbol"/>
-          <w:color w:val="1F2933"/>
-          <w:sz w:val="24"/>
-        </w:rPr>
-        <w:t>☐</w:t>
-      </w:r>
-      <w:r>
-        <w:rPr>
-          <w:rFonts w:ascii="Calibri" w:hAnsi="Calibri" w:eastAsia="Calibri"/>
-          <w:color w:val="1F2933"/>
-          <w:sz w:val="21"/>
-        </w:rPr>
-        <w:t xml:space="preserve">  </w:t>
-      </w:r>
-      <w:r>
-        <w:rPr>
-          <w:rFonts w:ascii="Calibri" w:hAnsi="Calibri" w:eastAsia="Calibri"/>
-          <w:color w:val="1F2933"/>
-          <w:sz w:val="21"/>
-        </w:rPr>
-        <w:t>Prepare a source-linked meeting brief</w:t>
-      </w:r>
-    </w:p>
-    <w:p>
-      <w:pPr>
-        <w:pStyle w:val="ResponseOption"/>
-      </w:pPr>
-      <w:r>
-        <w:rPr>
-          <w:rFonts w:ascii="Segoe UI Symbol" w:hAnsi="Segoe UI Symbol" w:eastAsia="Segoe UI Symbol"/>
-          <w:color w:val="1F2933"/>
-          <w:sz w:val="24"/>
-        </w:rPr>
-        <w:t>☐</w:t>
-      </w:r>
-      <w:r>
-        <w:rPr>
-          <w:rFonts w:ascii="Calibri" w:hAnsi="Calibri" w:eastAsia="Calibri"/>
-          <w:color w:val="1F2933"/>
-          <w:sz w:val="21"/>
-        </w:rPr>
-        <w:t xml:space="preserve">  </w:t>
-      </w:r>
-      <w:r>
-        <w:rPr>
-          <w:rFonts w:ascii="Calibri" w:hAnsi="Calibri" w:eastAsia="Calibri"/>
-          <w:color w:val="1F2933"/>
-          <w:sz w:val="21"/>
-        </w:rPr>
-        <w:t>Identify unresolved commitments</w:t>
-      </w:r>
-    </w:p>
-    <w:p>
-      <w:pPr>
-        <w:pStyle w:val="ResponseOption"/>
-      </w:pPr>
-      <w:r>
-        <w:rPr>
-          <w:rFonts w:ascii="Segoe UI Symbol" w:hAnsi="Segoe UI Symbol" w:eastAsia="Segoe UI Symbol"/>
-          <w:color w:val="1F2933"/>
-          <w:sz w:val="24"/>
-        </w:rPr>
-        <w:t>☐</w:t>
-      </w:r>
-      <w:r>
-        <w:rPr>
-          <w:rFonts w:ascii="Calibri" w:hAnsi="Calibri" w:eastAsia="Calibri"/>
-          <w:color w:val="1F2933"/>
-          <w:sz w:val="21"/>
-        </w:rPr>
-        <w:t xml:space="preserve">  </w:t>
-      </w:r>
-      <w:r>
-        <w:rPr>
-          <w:rFonts w:ascii="Calibri" w:hAnsi="Calibri" w:eastAsia="Calibri"/>
-          <w:color w:val="1F2933"/>
-          <w:sz w:val="21"/>
-        </w:rPr>
-        <w:t>Draft task descriptions</w:t>
-      </w:r>
-    </w:p>
-    <w:p>
-      <w:pPr>
-        <w:pStyle w:val="ResponseOption"/>
-      </w:pPr>
-      <w:r>
-        <w:rPr>
-          <w:rFonts w:ascii="Segoe UI Symbol" w:hAnsi="Segoe UI Symbol" w:eastAsia="Segoe UI Symbol"/>
-          <w:color w:val="1F2933"/>
-          <w:sz w:val="24"/>
-        </w:rPr>
-        <w:t>☐</w:t>
-      </w:r>
-      <w:r>
-        <w:rPr>
-          <w:rFonts w:ascii="Calibri" w:hAnsi="Calibri" w:eastAsia="Calibri"/>
-          <w:color w:val="1F2933"/>
-          <w:sz w:val="21"/>
-        </w:rPr>
-        <w:t xml:space="preserve">  </w:t>
-      </w:r>
-      <w:r>
-        <w:rPr>
-          <w:rFonts w:ascii="Calibri" w:hAnsi="Calibri" w:eastAsia="Calibri"/>
-          <w:color w:val="1F2933"/>
-          <w:sz w:val="21"/>
-        </w:rPr>
-        <w:t>None of these</w:t>
-      </w:r>
-    </w:p>
-    <w:p>
-      <w:pPr>
-        <w:pStyle w:val="ResponseOption"/>
-      </w:pPr>
-      <w:r>
-        <w:rPr>
-          <w:rFonts w:ascii="Segoe UI Symbol" w:hAnsi="Segoe UI Symbol" w:eastAsia="Segoe UI Symbol"/>
-          <w:color w:val="1F2933"/>
-          <w:sz w:val="24"/>
-        </w:rPr>
-        <w:t>☐</w:t>
-      </w:r>
-      <w:r>
-        <w:rPr>
-          <w:rFonts w:ascii="Calibri" w:hAnsi="Calibri" w:eastAsia="Calibri"/>
-          <w:color w:val="1F2933"/>
-          <w:sz w:val="21"/>
-        </w:rPr>
-        <w:t xml:space="preserve">  </w:t>
-      </w:r>
-      <w:r>
-        <w:rPr>
-          <w:rFonts w:ascii="Calibri" w:hAnsi="Calibri" w:eastAsia="Calibri"/>
-          <w:color w:val="1F2933"/>
-          <w:sz w:val="21"/>
-        </w:rPr>
-        <w:t>Other: ______________________________</w:t>
+        <w:t>More than 30 minutes</w:t>
       </w:r>
     </w:p>
     <w:p>
@@ -3564,422 +1158,7 @@
         <w:pStyle w:val="Question"/>
       </w:pPr>
       <w:r>
-        <w:t>What would you need to see before trusting an AI-generated summary or proposed action?</w:t>
-      </w:r>
-    </w:p>
-    <w:p>
-      <w:pPr>
-        <w:pStyle w:val="ResponseOption"/>
-      </w:pPr>
-      <w:r>
-        <w:rPr>
-          <w:rFonts w:ascii="Segoe UI Symbol" w:hAnsi="Segoe UI Symbol" w:eastAsia="Segoe UI Symbol"/>
-          <w:color w:val="1F2933"/>
-          <w:sz w:val="24"/>
-        </w:rPr>
-        <w:t>☐</w:t>
-      </w:r>
-      <w:r>
-        <w:rPr>
-          <w:rFonts w:ascii="Calibri" w:hAnsi="Calibri" w:eastAsia="Calibri"/>
-          <w:color w:val="1F2933"/>
-          <w:sz w:val="21"/>
-        </w:rPr>
-        <w:t xml:space="preserve">  </w:t>
-      </w:r>
-      <w:r>
-        <w:rPr>
-          <w:rFonts w:ascii="Calibri" w:hAnsi="Calibri" w:eastAsia="Calibri"/>
-          <w:color w:val="1F2933"/>
-          <w:sz w:val="21"/>
-        </w:rPr>
-        <w:t>The source note or event supporting each statement</w:t>
-      </w:r>
-    </w:p>
-    <w:p>
-      <w:pPr>
-        <w:pStyle w:val="ResponseOption"/>
-      </w:pPr>
-      <w:r>
-        <w:rPr>
-          <w:rFonts w:ascii="Segoe UI Symbol" w:hAnsi="Segoe UI Symbol" w:eastAsia="Segoe UI Symbol"/>
-          <w:color w:val="1F2933"/>
-          <w:sz w:val="24"/>
-        </w:rPr>
-        <w:t>☐</w:t>
-      </w:r>
-      <w:r>
-        <w:rPr>
-          <w:rFonts w:ascii="Calibri" w:hAnsi="Calibri" w:eastAsia="Calibri"/>
-          <w:color w:val="1F2933"/>
-          <w:sz w:val="21"/>
-        </w:rPr>
-        <w:t xml:space="preserve">  </w:t>
-      </w:r>
-      <w:r>
-        <w:rPr>
-          <w:rFonts w:ascii="Calibri" w:hAnsi="Calibri" w:eastAsia="Calibri"/>
-          <w:color w:val="1F2933"/>
-          <w:sz w:val="21"/>
-        </w:rPr>
-        <w:t>Clear labeling that the output is AI-generated</w:t>
-      </w:r>
-    </w:p>
-    <w:p>
-      <w:pPr>
-        <w:pStyle w:val="ResponseOption"/>
-      </w:pPr>
-      <w:r>
-        <w:rPr>
-          <w:rFonts w:ascii="Segoe UI Symbol" w:hAnsi="Segoe UI Symbol" w:eastAsia="Segoe UI Symbol"/>
-          <w:color w:val="1F2933"/>
-          <w:sz w:val="24"/>
-        </w:rPr>
-        <w:t>☐</w:t>
-      </w:r>
-      <w:r>
-        <w:rPr>
-          <w:rFonts w:ascii="Calibri" w:hAnsi="Calibri" w:eastAsia="Calibri"/>
-          <w:color w:val="1F2933"/>
-          <w:sz w:val="21"/>
-        </w:rPr>
-        <w:t xml:space="preserve">  </w:t>
-      </w:r>
-      <w:r>
-        <w:rPr>
-          <w:rFonts w:ascii="Calibri" w:hAnsi="Calibri" w:eastAsia="Calibri"/>
-          <w:color w:val="1F2933"/>
-          <w:sz w:val="21"/>
-        </w:rPr>
-        <w:t>The ability to edit before approval</w:t>
-      </w:r>
-    </w:p>
-    <w:p>
-      <w:pPr>
-        <w:pStyle w:val="ResponseOption"/>
-      </w:pPr>
-      <w:r>
-        <w:rPr>
-          <w:rFonts w:ascii="Segoe UI Symbol" w:hAnsi="Segoe UI Symbol" w:eastAsia="Segoe UI Symbol"/>
-          <w:color w:val="1F2933"/>
-          <w:sz w:val="24"/>
-        </w:rPr>
-        <w:t>☐</w:t>
-      </w:r>
-      <w:r>
-        <w:rPr>
-          <w:rFonts w:ascii="Calibri" w:hAnsi="Calibri" w:eastAsia="Calibri"/>
-          <w:color w:val="1F2933"/>
-          <w:sz w:val="21"/>
-        </w:rPr>
-        <w:t xml:space="preserve">  </w:t>
-      </w:r>
-      <w:r>
-        <w:rPr>
-          <w:rFonts w:ascii="Calibri" w:hAnsi="Calibri" w:eastAsia="Calibri"/>
-          <w:color w:val="1F2933"/>
-          <w:sz w:val="21"/>
-        </w:rPr>
-        <w:t>The ability to reject the entire output</w:t>
-      </w:r>
-    </w:p>
-    <w:p>
-      <w:pPr>
-        <w:pStyle w:val="ResponseOption"/>
-      </w:pPr>
-      <w:r>
-        <w:rPr>
-          <w:rFonts w:ascii="Segoe UI Symbol" w:hAnsi="Segoe UI Symbol" w:eastAsia="Segoe UI Symbol"/>
-          <w:color w:val="1F2933"/>
-          <w:sz w:val="24"/>
-        </w:rPr>
-        <w:t>☐</w:t>
-      </w:r>
-      <w:r>
-        <w:rPr>
-          <w:rFonts w:ascii="Calibri" w:hAnsi="Calibri" w:eastAsia="Calibri"/>
-          <w:color w:val="1F2933"/>
-          <w:sz w:val="21"/>
-        </w:rPr>
-        <w:t xml:space="preserve">  </w:t>
-      </w:r>
-      <w:r>
-        <w:rPr>
-          <w:rFonts w:ascii="Calibri" w:hAnsi="Calibri" w:eastAsia="Calibri"/>
-          <w:color w:val="1F2933"/>
-          <w:sz w:val="21"/>
-        </w:rPr>
-        <w:t>A visible correction history</w:t>
-      </w:r>
-    </w:p>
-    <w:p>
-      <w:pPr>
-        <w:pStyle w:val="ResponseOption"/>
-      </w:pPr>
-      <w:r>
-        <w:rPr>
-          <w:rFonts w:ascii="Segoe UI Symbol" w:hAnsi="Segoe UI Symbol" w:eastAsia="Segoe UI Symbol"/>
-          <w:color w:val="1F2933"/>
-          <w:sz w:val="24"/>
-        </w:rPr>
-        <w:t>☐</w:t>
-      </w:r>
-      <w:r>
-        <w:rPr>
-          <w:rFonts w:ascii="Calibri" w:hAnsi="Calibri" w:eastAsia="Calibri"/>
-          <w:color w:val="1F2933"/>
-          <w:sz w:val="21"/>
-        </w:rPr>
-        <w:t xml:space="preserve">  </w:t>
-      </w:r>
-      <w:r>
-        <w:rPr>
-          <w:rFonts w:ascii="Calibri" w:hAnsi="Calibri" w:eastAsia="Calibri"/>
-          <w:color w:val="1F2933"/>
-          <w:sz w:val="21"/>
-        </w:rPr>
-        <w:t>Information about uncertainty or missing context</w:t>
-      </w:r>
-    </w:p>
-    <w:p>
-      <w:pPr>
-        <w:pStyle w:val="ResponseOption"/>
-      </w:pPr>
-      <w:r>
-        <w:rPr>
-          <w:rFonts w:ascii="Segoe UI Symbol" w:hAnsi="Segoe UI Symbol" w:eastAsia="Segoe UI Symbol"/>
-          <w:color w:val="1F2933"/>
-          <w:sz w:val="24"/>
-        </w:rPr>
-        <w:t>☐</w:t>
-      </w:r>
-      <w:r>
-        <w:rPr>
-          <w:rFonts w:ascii="Calibri" w:hAnsi="Calibri" w:eastAsia="Calibri"/>
-          <w:color w:val="1F2933"/>
-          <w:sz w:val="21"/>
-        </w:rPr>
-        <w:t xml:space="preserve">  </w:t>
-      </w:r>
-      <w:r>
-        <w:rPr>
-          <w:rFonts w:ascii="Calibri" w:hAnsi="Calibri" w:eastAsia="Calibri"/>
-          <w:color w:val="1F2933"/>
-          <w:sz w:val="21"/>
-        </w:rPr>
-        <w:t>Other: ______________________________</w:t>
-      </w:r>
-    </w:p>
-    <w:p>
-      <w:pPr>
-        <w:keepNext/>
-        <w:numPr>
-          <w:ilvl w:val="0"/>
-          <w:numId w:val="10"/>
-        </w:numPr>
-        <w:pStyle w:val="Question"/>
-      </w:pPr>
-      <w:r>
-        <w:t>What should AI never generate, infer, or decide in this setting?</w:t>
-      </w:r>
-    </w:p>
-    <w:p>
-      <w:pPr>
-        <w:pStyle w:val="ResponseLine"/>
-        <w:pBdr>
-          <w:bottom w:val="single" w:sz="6" w:space="2" w:color="C9D5DF"/>
-        </w:pBdr>
-      </w:pPr>
-      <w:r>
-        <w:t xml:space="preserve"> </w:t>
-      </w:r>
-    </w:p>
-    <w:p>
-      <w:pPr>
-        <w:pStyle w:val="ResponseLine"/>
-        <w:pBdr>
-          <w:bottom w:val="single" w:sz="6" w:space="2" w:color="C9D5DF"/>
-        </w:pBdr>
-      </w:pPr>
-      <w:r>
-        <w:t xml:space="preserve"> </w:t>
-      </w:r>
-    </w:p>
-    <w:p>
-      <w:pPr>
-        <w:keepNext/>
-        <w:numPr>
-          <w:ilvl w:val="0"/>
-          <w:numId w:val="10"/>
-        </w:numPr>
-        <w:pStyle w:val="Question"/>
-      </w:pPr>
-      <w:r>
-        <w:t>Should clinician approval be required before AI-proposed information becomes part of a structured case record?</w:t>
-      </w:r>
-    </w:p>
-    <w:p>
-      <w:pPr>
-        <w:pStyle w:val="ResponseOption"/>
-      </w:pPr>
-      <w:r>
-        <w:rPr>
-          <w:rFonts w:ascii="Segoe UI Symbol" w:hAnsi="Segoe UI Symbol" w:eastAsia="Segoe UI Symbol"/>
-          <w:color w:val="1F2933"/>
-          <w:sz w:val="24"/>
-        </w:rPr>
-        <w:t>☐</w:t>
-      </w:r>
-      <w:r>
-        <w:rPr>
-          <w:rFonts w:ascii="Calibri" w:hAnsi="Calibri" w:eastAsia="Calibri"/>
-          <w:color w:val="1F2933"/>
-          <w:sz w:val="21"/>
-        </w:rPr>
-        <w:t xml:space="preserve">  </w:t>
-      </w:r>
-      <w:r>
-        <w:rPr>
-          <w:rFonts w:ascii="Calibri" w:hAnsi="Calibri" w:eastAsia="Calibri"/>
-          <w:color w:val="1F2933"/>
-          <w:sz w:val="21"/>
-        </w:rPr>
-        <w:t>Yes, always</w:t>
-      </w:r>
-    </w:p>
-    <w:p>
-      <w:pPr>
-        <w:pStyle w:val="ResponseOption"/>
-      </w:pPr>
-      <w:r>
-        <w:rPr>
-          <w:rFonts w:ascii="Segoe UI Symbol" w:hAnsi="Segoe UI Symbol" w:eastAsia="Segoe UI Symbol"/>
-          <w:color w:val="1F2933"/>
-          <w:sz w:val="24"/>
-        </w:rPr>
-        <w:t>☐</w:t>
-      </w:r>
-      <w:r>
-        <w:rPr>
-          <w:rFonts w:ascii="Calibri" w:hAnsi="Calibri" w:eastAsia="Calibri"/>
-          <w:color w:val="1F2933"/>
-          <w:sz w:val="21"/>
-        </w:rPr>
-        <w:t xml:space="preserve">  </w:t>
-      </w:r>
-      <w:r>
-        <w:rPr>
-          <w:rFonts w:ascii="Calibri" w:hAnsi="Calibri" w:eastAsia="Calibri"/>
-          <w:color w:val="1F2933"/>
-          <w:sz w:val="21"/>
-        </w:rPr>
-        <w:t>Yes, for certain information</w:t>
-      </w:r>
-    </w:p>
-    <w:p>
-      <w:pPr>
-        <w:pStyle w:val="ResponseOption"/>
-      </w:pPr>
-      <w:r>
-        <w:rPr>
-          <w:rFonts w:ascii="Segoe UI Symbol" w:hAnsi="Segoe UI Symbol" w:eastAsia="Segoe UI Symbol"/>
-          <w:color w:val="1F2933"/>
-          <w:sz w:val="24"/>
-        </w:rPr>
-        <w:t>☐</w:t>
-      </w:r>
-      <w:r>
-        <w:rPr>
-          <w:rFonts w:ascii="Calibri" w:hAnsi="Calibri" w:eastAsia="Calibri"/>
-          <w:color w:val="1F2933"/>
-          <w:sz w:val="21"/>
-        </w:rPr>
-        <w:t xml:space="preserve">  </w:t>
-      </w:r>
-      <w:r>
-        <w:rPr>
-          <w:rFonts w:ascii="Calibri" w:hAnsi="Calibri" w:eastAsia="Calibri"/>
-          <w:color w:val="1F2933"/>
-          <w:sz w:val="21"/>
-        </w:rPr>
-        <w:t>No</w:t>
-      </w:r>
-    </w:p>
-    <w:p>
-      <w:pPr>
-        <w:pStyle w:val="ResponseOption"/>
-      </w:pPr>
-      <w:r>
-        <w:rPr>
-          <w:rFonts w:ascii="Segoe UI Symbol" w:hAnsi="Segoe UI Symbol" w:eastAsia="Segoe UI Symbol"/>
-          <w:color w:val="1F2933"/>
-          <w:sz w:val="24"/>
-        </w:rPr>
-        <w:t>☐</w:t>
-      </w:r>
-      <w:r>
-        <w:rPr>
-          <w:rFonts w:ascii="Calibri" w:hAnsi="Calibri" w:eastAsia="Calibri"/>
-          <w:color w:val="1F2933"/>
-          <w:sz w:val="21"/>
-        </w:rPr>
-        <w:t xml:space="preserve">  </w:t>
-      </w:r>
-      <w:r>
-        <w:rPr>
-          <w:rFonts w:ascii="Calibri" w:hAnsi="Calibri" w:eastAsia="Calibri"/>
-          <w:color w:val="1F2933"/>
-          <w:sz w:val="21"/>
-        </w:rPr>
-        <w:t>Unsure</w:t>
-      </w:r>
-    </w:p>
-    <w:p>
-      <w:pPr>
-        <w:pStyle w:val="Instruction"/>
-        <w:spacing w:before="20"/>
-      </w:pPr>
-      <w:r>
-        <w:rPr>
-          <w:rFonts w:ascii="Calibri" w:hAnsi="Calibri" w:eastAsia="Calibri"/>
-          <w:i/>
-          <w:color w:val="5D6A73"/>
-          <w:sz w:val="19"/>
-        </w:rPr>
-        <w:t>Please explain.</w:t>
-      </w:r>
-    </w:p>
-    <w:p>
-      <w:pPr>
-        <w:pStyle w:val="ResponseLine"/>
-        <w:pBdr>
-          <w:bottom w:val="single" w:sz="6" w:space="2" w:color="C9D5DF"/>
-        </w:pBdr>
-      </w:pPr>
-      <w:r>
-        <w:t xml:space="preserve"> </w:t>
-      </w:r>
-    </w:p>
-    <w:p>
-      <w:pPr>
-        <w:pStyle w:val="Heading1"/>
-        <w:keepNext/>
-      </w:pPr>
-      <w:r>
-        <w:t>7. Product priorities</w:t>
-      </w:r>
-    </w:p>
-    <w:p>
-      <w:pPr>
-        <w:keepNext/>
-        <w:numPr>
-          <w:ilvl w:val="0"/>
-          <w:numId w:val="10"/>
-        </w:numPr>
-        <w:pStyle w:val="Question"/>
-      </w:pPr>
-      <w:r>
-        <w:t>Which single workflow would be most valuable to improve first?</w:t>
+        <w:t>Which one workflow would be most valuable to improve first?</w:t>
       </w:r>
     </w:p>
     <w:p>
@@ -4124,7 +1303,7 @@
           <w:color w:val="1F2933"/>
           <w:sz w:val="21"/>
         </w:rPr>
-        <w:t>Capturing and organizing case interactions</w:t>
+        <w:t>Tracking interventions and referrals</w:t>
       </w:r>
     </w:p>
     <w:p>
@@ -4153,7 +1332,20 @@
           <w:color w:val="1F2933"/>
           <w:sz w:val="21"/>
         </w:rPr>
-        <w:t>Tracking interventions and reviews</w:t>
+        <w:t>Coordinating action items across a team</w:t>
+      </w:r>
+    </w:p>
+    <w:p>
+      <w:pPr>
+        <w:keepNext/>
+        <w:numPr>
+          <w:ilvl w:val="0"/>
+          <w:numId w:val="10"/>
+        </w:numPr>
+        <w:pStyle w:val="Question"/>
+      </w:pPr>
+      <w:r>
+        <w:t>Which AI assistance would be most useful? Select up to two.</w:t>
       </w:r>
     </w:p>
     <w:p>
@@ -4182,7 +1374,7 @@
           <w:color w:val="1F2933"/>
           <w:sz w:val="21"/>
         </w:rPr>
-        <w:t>Tracking referrals through completion</w:t>
+        <w:t>Suggest follow-ups from a note</w:t>
       </w:r>
     </w:p>
     <w:p>
@@ -4211,7 +1403,506 @@
           <w:color w:val="1F2933"/>
           <w:sz w:val="21"/>
         </w:rPr>
-        <w:t>Coordinating actions across a team</w:t>
+        <w:t>Summarize recent case activity</w:t>
+      </w:r>
+    </w:p>
+    <w:p>
+      <w:pPr>
+        <w:pStyle w:val="ResponseOption"/>
+      </w:pPr>
+      <w:r>
+        <w:rPr>
+          <w:rFonts w:ascii="Segoe UI Symbol" w:hAnsi="Segoe UI Symbol" w:eastAsia="Segoe UI Symbol"/>
+          <w:color w:val="1F2933"/>
+          <w:sz w:val="24"/>
+        </w:rPr>
+        <w:t>☐</w:t>
+      </w:r>
+      <w:r>
+        <w:rPr>
+          <w:rFonts w:ascii="Calibri" w:hAnsi="Calibri" w:eastAsia="Calibri"/>
+          <w:color w:val="1F2933"/>
+          <w:sz w:val="21"/>
+        </w:rPr>
+        <w:t xml:space="preserve">  </w:t>
+      </w:r>
+      <w:r>
+        <w:rPr>
+          <w:rFonts w:ascii="Calibri" w:hAnsi="Calibri" w:eastAsia="Calibri"/>
+          <w:color w:val="1F2933"/>
+          <w:sz w:val="21"/>
+        </w:rPr>
+        <w:t>Prepare a meeting brief</w:t>
+      </w:r>
+    </w:p>
+    <w:p>
+      <w:pPr>
+        <w:pStyle w:val="ResponseOption"/>
+      </w:pPr>
+      <w:r>
+        <w:rPr>
+          <w:rFonts w:ascii="Segoe UI Symbol" w:hAnsi="Segoe UI Symbol" w:eastAsia="Segoe UI Symbol"/>
+          <w:color w:val="1F2933"/>
+          <w:sz w:val="24"/>
+        </w:rPr>
+        <w:t>☐</w:t>
+      </w:r>
+      <w:r>
+        <w:rPr>
+          <w:rFonts w:ascii="Calibri" w:hAnsi="Calibri" w:eastAsia="Calibri"/>
+          <w:color w:val="1F2933"/>
+          <w:sz w:val="21"/>
+        </w:rPr>
+        <w:t xml:space="preserve">  </w:t>
+      </w:r>
+      <w:r>
+        <w:rPr>
+          <w:rFonts w:ascii="Calibri" w:hAnsi="Calibri" w:eastAsia="Calibri"/>
+          <w:color w:val="1F2933"/>
+          <w:sz w:val="21"/>
+        </w:rPr>
+        <w:t>Identify unresolved commitments</w:t>
+      </w:r>
+    </w:p>
+    <w:p>
+      <w:pPr>
+        <w:pStyle w:val="ResponseOption"/>
+      </w:pPr>
+      <w:r>
+        <w:rPr>
+          <w:rFonts w:ascii="Segoe UI Symbol" w:hAnsi="Segoe UI Symbol" w:eastAsia="Segoe UI Symbol"/>
+          <w:color w:val="1F2933"/>
+          <w:sz w:val="24"/>
+        </w:rPr>
+        <w:t>☐</w:t>
+      </w:r>
+      <w:r>
+        <w:rPr>
+          <w:rFonts w:ascii="Calibri" w:hAnsi="Calibri" w:eastAsia="Calibri"/>
+          <w:color w:val="1F2933"/>
+          <w:sz w:val="21"/>
+        </w:rPr>
+        <w:t xml:space="preserve">  </w:t>
+      </w:r>
+      <w:r>
+        <w:rPr>
+          <w:rFonts w:ascii="Calibri" w:hAnsi="Calibri" w:eastAsia="Calibri"/>
+          <w:color w:val="1F2933"/>
+          <w:sz w:val="21"/>
+        </w:rPr>
+        <w:t>Organize a student timeline</w:t>
+      </w:r>
+    </w:p>
+    <w:p>
+      <w:pPr>
+        <w:pStyle w:val="ResponseOption"/>
+      </w:pPr>
+      <w:r>
+        <w:rPr>
+          <w:rFonts w:ascii="Segoe UI Symbol" w:hAnsi="Segoe UI Symbol" w:eastAsia="Segoe UI Symbol"/>
+          <w:color w:val="1F2933"/>
+          <w:sz w:val="24"/>
+        </w:rPr>
+        <w:t>☐</w:t>
+      </w:r>
+      <w:r>
+        <w:rPr>
+          <w:rFonts w:ascii="Calibri" w:hAnsi="Calibri" w:eastAsia="Calibri"/>
+          <w:color w:val="1F2933"/>
+          <w:sz w:val="21"/>
+        </w:rPr>
+        <w:t xml:space="preserve">  </w:t>
+      </w:r>
+      <w:r>
+        <w:rPr>
+          <w:rFonts w:ascii="Calibri" w:hAnsi="Calibri" w:eastAsia="Calibri"/>
+          <w:color w:val="1F2933"/>
+          <w:sz w:val="21"/>
+        </w:rPr>
+        <w:t>I would not want AI assistance</w:t>
+      </w:r>
+    </w:p>
+    <w:p>
+      <w:pPr>
+        <w:keepNext/>
+        <w:numPr>
+          <w:ilvl w:val="0"/>
+          <w:numId w:val="10"/>
+        </w:numPr>
+        <w:pStyle w:val="Question"/>
+      </w:pPr>
+      <w:r>
+        <w:t>What would you need in order to trust AI-generated information? Select all that apply.</w:t>
+      </w:r>
+    </w:p>
+    <w:p>
+      <w:pPr>
+        <w:pStyle w:val="ResponseOption"/>
+      </w:pPr>
+      <w:r>
+        <w:rPr>
+          <w:rFonts w:ascii="Segoe UI Symbol" w:hAnsi="Segoe UI Symbol" w:eastAsia="Segoe UI Symbol"/>
+          <w:color w:val="1F2933"/>
+          <w:sz w:val="24"/>
+        </w:rPr>
+        <w:t>☐</w:t>
+      </w:r>
+      <w:r>
+        <w:rPr>
+          <w:rFonts w:ascii="Calibri" w:hAnsi="Calibri" w:eastAsia="Calibri"/>
+          <w:color w:val="1F2933"/>
+          <w:sz w:val="21"/>
+        </w:rPr>
+        <w:t xml:space="preserve">  </w:t>
+      </w:r>
+      <w:r>
+        <w:rPr>
+          <w:rFonts w:ascii="Calibri" w:hAnsi="Calibri" w:eastAsia="Calibri"/>
+          <w:color w:val="1F2933"/>
+          <w:sz w:val="21"/>
+        </w:rPr>
+        <w:t>A link to the source information</w:t>
+      </w:r>
+    </w:p>
+    <w:p>
+      <w:pPr>
+        <w:pStyle w:val="ResponseOption"/>
+      </w:pPr>
+      <w:r>
+        <w:rPr>
+          <w:rFonts w:ascii="Segoe UI Symbol" w:hAnsi="Segoe UI Symbol" w:eastAsia="Segoe UI Symbol"/>
+          <w:color w:val="1F2933"/>
+          <w:sz w:val="24"/>
+        </w:rPr>
+        <w:t>☐</w:t>
+      </w:r>
+      <w:r>
+        <w:rPr>
+          <w:rFonts w:ascii="Calibri" w:hAnsi="Calibri" w:eastAsia="Calibri"/>
+          <w:color w:val="1F2933"/>
+          <w:sz w:val="21"/>
+        </w:rPr>
+        <w:t xml:space="preserve">  </w:t>
+      </w:r>
+      <w:r>
+        <w:rPr>
+          <w:rFonts w:ascii="Calibri" w:hAnsi="Calibri" w:eastAsia="Calibri"/>
+          <w:color w:val="1F2933"/>
+          <w:sz w:val="21"/>
+        </w:rPr>
+        <w:t>Clear labeling that AI created it</w:t>
+      </w:r>
+    </w:p>
+    <w:p>
+      <w:pPr>
+        <w:pStyle w:val="ResponseOption"/>
+      </w:pPr>
+      <w:r>
+        <w:rPr>
+          <w:rFonts w:ascii="Segoe UI Symbol" w:hAnsi="Segoe UI Symbol" w:eastAsia="Segoe UI Symbol"/>
+          <w:color w:val="1F2933"/>
+          <w:sz w:val="24"/>
+        </w:rPr>
+        <w:t>☐</w:t>
+      </w:r>
+      <w:r>
+        <w:rPr>
+          <w:rFonts w:ascii="Calibri" w:hAnsi="Calibri" w:eastAsia="Calibri"/>
+          <w:color w:val="1F2933"/>
+          <w:sz w:val="21"/>
+        </w:rPr>
+        <w:t xml:space="preserve">  </w:t>
+      </w:r>
+      <w:r>
+        <w:rPr>
+          <w:rFonts w:ascii="Calibri" w:hAnsi="Calibri" w:eastAsia="Calibri"/>
+          <w:color w:val="1F2933"/>
+          <w:sz w:val="21"/>
+        </w:rPr>
+        <w:t>The ability to review and edit it before saving</w:t>
+      </w:r>
+    </w:p>
+    <w:p>
+      <w:pPr>
+        <w:pStyle w:val="ResponseOption"/>
+      </w:pPr>
+      <w:r>
+        <w:rPr>
+          <w:rFonts w:ascii="Segoe UI Symbol" w:hAnsi="Segoe UI Symbol" w:eastAsia="Segoe UI Symbol"/>
+          <w:color w:val="1F2933"/>
+          <w:sz w:val="24"/>
+        </w:rPr>
+        <w:t>☐</w:t>
+      </w:r>
+      <w:r>
+        <w:rPr>
+          <w:rFonts w:ascii="Calibri" w:hAnsi="Calibri" w:eastAsia="Calibri"/>
+          <w:color w:val="1F2933"/>
+          <w:sz w:val="21"/>
+        </w:rPr>
+        <w:t xml:space="preserve">  </w:t>
+      </w:r>
+      <w:r>
+        <w:rPr>
+          <w:rFonts w:ascii="Calibri" w:hAnsi="Calibri" w:eastAsia="Calibri"/>
+          <w:color w:val="1F2933"/>
+          <w:sz w:val="21"/>
+        </w:rPr>
+        <w:t>The ability to reject it completely</w:t>
+      </w:r>
+    </w:p>
+    <w:p>
+      <w:pPr>
+        <w:pStyle w:val="ResponseOption"/>
+      </w:pPr>
+      <w:r>
+        <w:rPr>
+          <w:rFonts w:ascii="Segoe UI Symbol" w:hAnsi="Segoe UI Symbol" w:eastAsia="Segoe UI Symbol"/>
+          <w:color w:val="1F2933"/>
+          <w:sz w:val="24"/>
+        </w:rPr>
+        <w:t>☐</w:t>
+      </w:r>
+      <w:r>
+        <w:rPr>
+          <w:rFonts w:ascii="Calibri" w:hAnsi="Calibri" w:eastAsia="Calibri"/>
+          <w:color w:val="1F2933"/>
+          <w:sz w:val="21"/>
+        </w:rPr>
+        <w:t xml:space="preserve">  </w:t>
+      </w:r>
+      <w:r>
+        <w:rPr>
+          <w:rFonts w:ascii="Calibri" w:hAnsi="Calibri" w:eastAsia="Calibri"/>
+          <w:color w:val="1F2933"/>
+          <w:sz w:val="21"/>
+        </w:rPr>
+        <w:t>A visible correction history</w:t>
+      </w:r>
+    </w:p>
+    <w:p>
+      <w:pPr>
+        <w:pStyle w:val="ResponseOption"/>
+      </w:pPr>
+      <w:r>
+        <w:rPr>
+          <w:rFonts w:ascii="Segoe UI Symbol" w:hAnsi="Segoe UI Symbol" w:eastAsia="Segoe UI Symbol"/>
+          <w:color w:val="1F2933"/>
+          <w:sz w:val="24"/>
+        </w:rPr>
+        <w:t>☐</w:t>
+      </w:r>
+      <w:r>
+        <w:rPr>
+          <w:rFonts w:ascii="Calibri" w:hAnsi="Calibri" w:eastAsia="Calibri"/>
+          <w:color w:val="1F2933"/>
+          <w:sz w:val="21"/>
+        </w:rPr>
+        <w:t xml:space="preserve">  </w:t>
+      </w:r>
+      <w:r>
+        <w:rPr>
+          <w:rFonts w:ascii="Calibri" w:hAnsi="Calibri" w:eastAsia="Calibri"/>
+          <w:color w:val="1F2933"/>
+          <w:sz w:val="21"/>
+        </w:rPr>
+        <w:t>I would not trust AI with this work</w:t>
+      </w:r>
+    </w:p>
+    <w:p>
+      <w:pPr>
+        <w:pStyle w:val="Heading1"/>
+        <w:pageBreakBefore/>
+      </w:pPr>
+      <w:r>
+        <w:t>Adoption</w:t>
+      </w:r>
+    </w:p>
+    <w:p>
+      <w:pPr>
+        <w:keepNext/>
+        <w:numPr>
+          <w:ilvl w:val="0"/>
+          <w:numId w:val="10"/>
+        </w:numPr>
+        <w:pStyle w:val="Question"/>
+      </w:pPr>
+      <w:r>
+        <w:t>What would be the biggest reason not to use CasePilot?</w:t>
+      </w:r>
+    </w:p>
+    <w:p>
+      <w:pPr>
+        <w:pStyle w:val="ResponseOption"/>
+      </w:pPr>
+      <w:r>
+        <w:rPr>
+          <w:rFonts w:ascii="Segoe UI Symbol" w:hAnsi="Segoe UI Symbol" w:eastAsia="Segoe UI Symbol"/>
+          <w:color w:val="1F2933"/>
+          <w:sz w:val="24"/>
+        </w:rPr>
+        <w:t>☐</w:t>
+      </w:r>
+      <w:r>
+        <w:rPr>
+          <w:rFonts w:ascii="Calibri" w:hAnsi="Calibri" w:eastAsia="Calibri"/>
+          <w:color w:val="1F2933"/>
+          <w:sz w:val="21"/>
+        </w:rPr>
+        <w:t xml:space="preserve">  </w:t>
+      </w:r>
+      <w:r>
+        <w:rPr>
+          <w:rFonts w:ascii="Calibri" w:hAnsi="Calibri" w:eastAsia="Calibri"/>
+          <w:color w:val="1F2933"/>
+          <w:sz w:val="21"/>
+        </w:rPr>
+        <w:t>Student privacy or security concerns</w:t>
+      </w:r>
+    </w:p>
+    <w:p>
+      <w:pPr>
+        <w:pStyle w:val="ResponseOption"/>
+      </w:pPr>
+      <w:r>
+        <w:rPr>
+          <w:rFonts w:ascii="Segoe UI Symbol" w:hAnsi="Segoe UI Symbol" w:eastAsia="Segoe UI Symbol"/>
+          <w:color w:val="1F2933"/>
+          <w:sz w:val="24"/>
+        </w:rPr>
+        <w:t>☐</w:t>
+      </w:r>
+      <w:r>
+        <w:rPr>
+          <w:rFonts w:ascii="Calibri" w:hAnsi="Calibri" w:eastAsia="Calibri"/>
+          <w:color w:val="1F2933"/>
+          <w:sz w:val="21"/>
+        </w:rPr>
+        <w:t xml:space="preserve">  </w:t>
+      </w:r>
+      <w:r>
+        <w:rPr>
+          <w:rFonts w:ascii="Calibri" w:hAnsi="Calibri" w:eastAsia="Calibri"/>
+          <w:color w:val="1F2933"/>
+          <w:sz w:val="21"/>
+        </w:rPr>
+        <w:t>Duplicate work with existing systems</w:t>
+      </w:r>
+    </w:p>
+    <w:p>
+      <w:pPr>
+        <w:pStyle w:val="ResponseOption"/>
+      </w:pPr>
+      <w:r>
+        <w:rPr>
+          <w:rFonts w:ascii="Segoe UI Symbol" w:hAnsi="Segoe UI Symbol" w:eastAsia="Segoe UI Symbol"/>
+          <w:color w:val="1F2933"/>
+          <w:sz w:val="24"/>
+        </w:rPr>
+        <w:t>☐</w:t>
+      </w:r>
+      <w:r>
+        <w:rPr>
+          <w:rFonts w:ascii="Calibri" w:hAnsi="Calibri" w:eastAsia="Calibri"/>
+          <w:color w:val="1F2933"/>
+          <w:sz w:val="21"/>
+        </w:rPr>
+        <w:t xml:space="preserve">  </w:t>
+      </w:r>
+      <w:r>
+        <w:rPr>
+          <w:rFonts w:ascii="Calibri" w:hAnsi="Calibri" w:eastAsia="Calibri"/>
+          <w:color w:val="1F2933"/>
+          <w:sz w:val="21"/>
+        </w:rPr>
+        <w:t>Inaccurate AI output</w:t>
+      </w:r>
+    </w:p>
+    <w:p>
+      <w:pPr>
+        <w:pStyle w:val="ResponseOption"/>
+      </w:pPr>
+      <w:r>
+        <w:rPr>
+          <w:rFonts w:ascii="Segoe UI Symbol" w:hAnsi="Segoe UI Symbol" w:eastAsia="Segoe UI Symbol"/>
+          <w:color w:val="1F2933"/>
+          <w:sz w:val="24"/>
+        </w:rPr>
+        <w:t>☐</w:t>
+      </w:r>
+      <w:r>
+        <w:rPr>
+          <w:rFonts w:ascii="Calibri" w:hAnsi="Calibri" w:eastAsia="Calibri"/>
+          <w:color w:val="1F2933"/>
+          <w:sz w:val="21"/>
+        </w:rPr>
+        <w:t xml:space="preserve">  </w:t>
+      </w:r>
+      <w:r>
+        <w:rPr>
+          <w:rFonts w:ascii="Calibri" w:hAnsi="Calibri" w:eastAsia="Calibri"/>
+          <w:color w:val="1F2933"/>
+          <w:sz w:val="21"/>
+        </w:rPr>
+        <w:t>Too many alerts or reminders</w:t>
+      </w:r>
+    </w:p>
+    <w:p>
+      <w:pPr>
+        <w:pStyle w:val="ResponseOption"/>
+      </w:pPr>
+      <w:r>
+        <w:rPr>
+          <w:rFonts w:ascii="Segoe UI Symbol" w:hAnsi="Segoe UI Symbol" w:eastAsia="Segoe UI Symbol"/>
+          <w:color w:val="1F2933"/>
+          <w:sz w:val="24"/>
+        </w:rPr>
+        <w:t>☐</w:t>
+      </w:r>
+      <w:r>
+        <w:rPr>
+          <w:rFonts w:ascii="Calibri" w:hAnsi="Calibri" w:eastAsia="Calibri"/>
+          <w:color w:val="1F2933"/>
+          <w:sz w:val="21"/>
+        </w:rPr>
+        <w:t xml:space="preserve">  </w:t>
+      </w:r>
+      <w:r>
+        <w:rPr>
+          <w:rFonts w:ascii="Calibri" w:hAnsi="Calibri" w:eastAsia="Calibri"/>
+          <w:color w:val="1F2933"/>
+          <w:sz w:val="21"/>
+        </w:rPr>
+        <w:t>It would not fit my workflow</w:t>
+      </w:r>
+    </w:p>
+    <w:p>
+      <w:pPr>
+        <w:pStyle w:val="ResponseOption"/>
+      </w:pPr>
+      <w:r>
+        <w:rPr>
+          <w:rFonts w:ascii="Segoe UI Symbol" w:hAnsi="Segoe UI Symbol" w:eastAsia="Segoe UI Symbol"/>
+          <w:color w:val="1F2933"/>
+          <w:sz w:val="24"/>
+        </w:rPr>
+        <w:t>☐</w:t>
+      </w:r>
+      <w:r>
+        <w:rPr>
+          <w:rFonts w:ascii="Calibri" w:hAnsi="Calibri" w:eastAsia="Calibri"/>
+          <w:color w:val="1F2933"/>
+          <w:sz w:val="21"/>
+        </w:rPr>
+        <w:t xml:space="preserve">  </w:t>
+      </w:r>
+      <w:r>
+        <w:rPr>
+          <w:rFonts w:ascii="Calibri" w:hAnsi="Calibri" w:eastAsia="Calibri"/>
+          <w:color w:val="1F2933"/>
+          <w:sz w:val="21"/>
+        </w:rPr>
+        <w:t>Cost</w:t>
       </w:r>
     </w:p>
     <w:p>
@@ -4253,349 +1944,7 @@
         <w:pStyle w:val="Question"/>
       </w:pPr>
       <w:r>
-        <w:t>Which integration, if any, would be essential for an initial version?</w:t>
-      </w:r>
-    </w:p>
-    <w:p>
-      <w:pPr>
-        <w:pStyle w:val="ResponseOption"/>
-      </w:pPr>
-      <w:r>
-        <w:rPr>
-          <w:rFonts w:ascii="Segoe UI Symbol" w:hAnsi="Segoe UI Symbol" w:eastAsia="Segoe UI Symbol"/>
-          <w:color w:val="1F2933"/>
-          <w:sz w:val="24"/>
-        </w:rPr>
-        <w:t>☐</w:t>
-      </w:r>
-      <w:r>
-        <w:rPr>
-          <w:rFonts w:ascii="Calibri" w:hAnsi="Calibri" w:eastAsia="Calibri"/>
-          <w:color w:val="1F2933"/>
-          <w:sz w:val="21"/>
-        </w:rPr>
-        <w:t xml:space="preserve">  </w:t>
-      </w:r>
-      <w:r>
-        <w:rPr>
-          <w:rFonts w:ascii="Calibri" w:hAnsi="Calibri" w:eastAsia="Calibri"/>
-          <w:color w:val="1F2933"/>
-          <w:sz w:val="21"/>
-        </w:rPr>
-        <w:t>None initially</w:t>
-      </w:r>
-    </w:p>
-    <w:p>
-      <w:pPr>
-        <w:pStyle w:val="ResponseOption"/>
-      </w:pPr>
-      <w:r>
-        <w:rPr>
-          <w:rFonts w:ascii="Segoe UI Symbol" w:hAnsi="Segoe UI Symbol" w:eastAsia="Segoe UI Symbol"/>
-          <w:color w:val="1F2933"/>
-          <w:sz w:val="24"/>
-        </w:rPr>
-        <w:t>☐</w:t>
-      </w:r>
-      <w:r>
-        <w:rPr>
-          <w:rFonts w:ascii="Calibri" w:hAnsi="Calibri" w:eastAsia="Calibri"/>
-          <w:color w:val="1F2933"/>
-          <w:sz w:val="21"/>
-        </w:rPr>
-        <w:t xml:space="preserve">  </w:t>
-      </w:r>
-      <w:r>
-        <w:rPr>
-          <w:rFonts w:ascii="Calibri" w:hAnsi="Calibri" w:eastAsia="Calibri"/>
-          <w:color w:val="1F2933"/>
-          <w:sz w:val="21"/>
-        </w:rPr>
-        <w:t>Student information system</w:t>
-      </w:r>
-    </w:p>
-    <w:p>
-      <w:pPr>
-        <w:pStyle w:val="ResponseOption"/>
-      </w:pPr>
-      <w:r>
-        <w:rPr>
-          <w:rFonts w:ascii="Segoe UI Symbol" w:hAnsi="Segoe UI Symbol" w:eastAsia="Segoe UI Symbol"/>
-          <w:color w:val="1F2933"/>
-          <w:sz w:val="24"/>
-        </w:rPr>
-        <w:t>☐</w:t>
-      </w:r>
-      <w:r>
-        <w:rPr>
-          <w:rFonts w:ascii="Calibri" w:hAnsi="Calibri" w:eastAsia="Calibri"/>
-          <w:color w:val="1F2933"/>
-          <w:sz w:val="21"/>
-        </w:rPr>
-        <w:t xml:space="preserve">  </w:t>
-      </w:r>
-      <w:r>
-        <w:rPr>
-          <w:rFonts w:ascii="Calibri" w:hAnsi="Calibri" w:eastAsia="Calibri"/>
-          <w:color w:val="1F2933"/>
-          <w:sz w:val="21"/>
-        </w:rPr>
-        <w:t>IEP/504 or special-education system</w:t>
-      </w:r>
-    </w:p>
-    <w:p>
-      <w:pPr>
-        <w:pStyle w:val="ResponseOption"/>
-      </w:pPr>
-      <w:r>
-        <w:rPr>
-          <w:rFonts w:ascii="Segoe UI Symbol" w:hAnsi="Segoe UI Symbol" w:eastAsia="Segoe UI Symbol"/>
-          <w:color w:val="1F2933"/>
-          <w:sz w:val="24"/>
-        </w:rPr>
-        <w:t>☐</w:t>
-      </w:r>
-      <w:r>
-        <w:rPr>
-          <w:rFonts w:ascii="Calibri" w:hAnsi="Calibri" w:eastAsia="Calibri"/>
-          <w:color w:val="1F2933"/>
-          <w:sz w:val="21"/>
-        </w:rPr>
-        <w:t xml:space="preserve">  </w:t>
-      </w:r>
-      <w:r>
-        <w:rPr>
-          <w:rFonts w:ascii="Calibri" w:hAnsi="Calibri" w:eastAsia="Calibri"/>
-          <w:color w:val="1F2933"/>
-          <w:sz w:val="21"/>
-        </w:rPr>
-        <w:t>Email</w:t>
-      </w:r>
-    </w:p>
-    <w:p>
-      <w:pPr>
-        <w:pStyle w:val="ResponseOption"/>
-      </w:pPr>
-      <w:r>
-        <w:rPr>
-          <w:rFonts w:ascii="Segoe UI Symbol" w:hAnsi="Segoe UI Symbol" w:eastAsia="Segoe UI Symbol"/>
-          <w:color w:val="1F2933"/>
-          <w:sz w:val="24"/>
-        </w:rPr>
-        <w:t>☐</w:t>
-      </w:r>
-      <w:r>
-        <w:rPr>
-          <w:rFonts w:ascii="Calibri" w:hAnsi="Calibri" w:eastAsia="Calibri"/>
-          <w:color w:val="1F2933"/>
-          <w:sz w:val="21"/>
-        </w:rPr>
-        <w:t xml:space="preserve">  </w:t>
-      </w:r>
-      <w:r>
-        <w:rPr>
-          <w:rFonts w:ascii="Calibri" w:hAnsi="Calibri" w:eastAsia="Calibri"/>
-          <w:color w:val="1F2933"/>
-          <w:sz w:val="21"/>
-        </w:rPr>
-        <w:t>Calendar</w:t>
-      </w:r>
-    </w:p>
-    <w:p>
-      <w:pPr>
-        <w:pStyle w:val="ResponseOption"/>
-      </w:pPr>
-      <w:r>
-        <w:rPr>
-          <w:rFonts w:ascii="Segoe UI Symbol" w:hAnsi="Segoe UI Symbol" w:eastAsia="Segoe UI Symbol"/>
-          <w:color w:val="1F2933"/>
-          <w:sz w:val="24"/>
-        </w:rPr>
-        <w:t>☐</w:t>
-      </w:r>
-      <w:r>
-        <w:rPr>
-          <w:rFonts w:ascii="Calibri" w:hAnsi="Calibri" w:eastAsia="Calibri"/>
-          <w:color w:val="1F2933"/>
-          <w:sz w:val="21"/>
-        </w:rPr>
-        <w:t xml:space="preserve">  </w:t>
-      </w:r>
-      <w:r>
-        <w:rPr>
-          <w:rFonts w:ascii="Calibri" w:hAnsi="Calibri" w:eastAsia="Calibri"/>
-          <w:color w:val="1F2933"/>
-          <w:sz w:val="21"/>
-        </w:rPr>
-        <w:t>Identity/single sign-on</w:t>
-      </w:r>
-    </w:p>
-    <w:p>
-      <w:pPr>
-        <w:pStyle w:val="ResponseOption"/>
-      </w:pPr>
-      <w:r>
-        <w:rPr>
-          <w:rFonts w:ascii="Segoe UI Symbol" w:hAnsi="Segoe UI Symbol" w:eastAsia="Segoe UI Symbol"/>
-          <w:color w:val="1F2933"/>
-          <w:sz w:val="24"/>
-        </w:rPr>
-        <w:t>☐</w:t>
-      </w:r>
-      <w:r>
-        <w:rPr>
-          <w:rFonts w:ascii="Calibri" w:hAnsi="Calibri" w:eastAsia="Calibri"/>
-          <w:color w:val="1F2933"/>
-          <w:sz w:val="21"/>
-        </w:rPr>
-        <w:t xml:space="preserve">  </w:t>
-      </w:r>
-      <w:r>
-        <w:rPr>
-          <w:rFonts w:ascii="Calibri" w:hAnsi="Calibri" w:eastAsia="Calibri"/>
-          <w:color w:val="1F2933"/>
-          <w:sz w:val="21"/>
-        </w:rPr>
-        <w:t>Other: ______________________________</w:t>
-      </w:r>
-    </w:p>
-    <w:p>
-      <w:pPr>
-        <w:keepNext/>
-        <w:numPr>
-          <w:ilvl w:val="0"/>
-          <w:numId w:val="10"/>
-        </w:numPr>
-        <w:pStyle w:val="Question"/>
-      </w:pPr>
-      <w:r>
-        <w:t>Would document or file upload be essential to your workflow?</w:t>
-      </w:r>
-    </w:p>
-    <w:p>
-      <w:pPr>
-        <w:pStyle w:val="ResponseOption"/>
-      </w:pPr>
-      <w:r>
-        <w:rPr>
-          <w:rFonts w:ascii="Segoe UI Symbol" w:hAnsi="Segoe UI Symbol" w:eastAsia="Segoe UI Symbol"/>
-          <w:color w:val="1F2933"/>
-          <w:sz w:val="24"/>
-        </w:rPr>
-        <w:t>☐</w:t>
-      </w:r>
-      <w:r>
-        <w:rPr>
-          <w:rFonts w:ascii="Calibri" w:hAnsi="Calibri" w:eastAsia="Calibri"/>
-          <w:color w:val="1F2933"/>
-          <w:sz w:val="21"/>
-        </w:rPr>
-        <w:t xml:space="preserve">  </w:t>
-      </w:r>
-      <w:r>
-        <w:rPr>
-          <w:rFonts w:ascii="Calibri" w:hAnsi="Calibri" w:eastAsia="Calibri"/>
-          <w:color w:val="1F2933"/>
-          <w:sz w:val="21"/>
-        </w:rPr>
-        <w:t>Yes</w:t>
-      </w:r>
-    </w:p>
-    <w:p>
-      <w:pPr>
-        <w:pStyle w:val="ResponseOption"/>
-      </w:pPr>
-      <w:r>
-        <w:rPr>
-          <w:rFonts w:ascii="Segoe UI Symbol" w:hAnsi="Segoe UI Symbol" w:eastAsia="Segoe UI Symbol"/>
-          <w:color w:val="1F2933"/>
-          <w:sz w:val="24"/>
-        </w:rPr>
-        <w:t>☐</w:t>
-      </w:r>
-      <w:r>
-        <w:rPr>
-          <w:rFonts w:ascii="Calibri" w:hAnsi="Calibri" w:eastAsia="Calibri"/>
-          <w:color w:val="1F2933"/>
-          <w:sz w:val="21"/>
-        </w:rPr>
-        <w:t xml:space="preserve">  </w:t>
-      </w:r>
-      <w:r>
-        <w:rPr>
-          <w:rFonts w:ascii="Calibri" w:hAnsi="Calibri" w:eastAsia="Calibri"/>
-          <w:color w:val="1F2933"/>
-          <w:sz w:val="21"/>
-        </w:rPr>
-        <w:t>No</w:t>
-      </w:r>
-    </w:p>
-    <w:p>
-      <w:pPr>
-        <w:pStyle w:val="ResponseOption"/>
-      </w:pPr>
-      <w:r>
-        <w:rPr>
-          <w:rFonts w:ascii="Segoe UI Symbol" w:hAnsi="Segoe UI Symbol" w:eastAsia="Segoe UI Symbol"/>
-          <w:color w:val="1F2933"/>
-          <w:sz w:val="24"/>
-        </w:rPr>
-        <w:t>☐</w:t>
-      </w:r>
-      <w:r>
-        <w:rPr>
-          <w:rFonts w:ascii="Calibri" w:hAnsi="Calibri" w:eastAsia="Calibri"/>
-          <w:color w:val="1F2933"/>
-          <w:sz w:val="21"/>
-        </w:rPr>
-        <w:t xml:space="preserve">  </w:t>
-      </w:r>
-      <w:r>
-        <w:rPr>
-          <w:rFonts w:ascii="Calibri" w:hAnsi="Calibri" w:eastAsia="Calibri"/>
-          <w:color w:val="1F2933"/>
-          <w:sz w:val="21"/>
-        </w:rPr>
-        <w:t>Unsure</w:t>
-      </w:r>
-    </w:p>
-    <w:p>
-      <w:pPr>
-        <w:pStyle w:val="Instruction"/>
-        <w:spacing w:before="20"/>
-      </w:pPr>
-      <w:r>
-        <w:rPr>
-          <w:rFonts w:ascii="Calibri" w:hAnsi="Calibri" w:eastAsia="Calibri"/>
-          <w:i/>
-          <w:color w:val="5D6A73"/>
-          <w:sz w:val="19"/>
-        </w:rPr>
-        <w:t>Why?</w:t>
-      </w:r>
-    </w:p>
-    <w:p>
-      <w:pPr>
-        <w:pStyle w:val="ResponseLine"/>
-        <w:pBdr>
-          <w:bottom w:val="single" w:sz="6" w:space="2" w:color="C9D5DF"/>
-        </w:pBdr>
-      </w:pPr>
-      <w:r>
-        <w:t xml:space="preserve"> </w:t>
-      </w:r>
-    </w:p>
-    <w:p>
-      <w:pPr>
-        <w:keepNext/>
-        <w:numPr>
-          <w:ilvl w:val="0"/>
-          <w:numId w:val="10"/>
-        </w:numPr>
-        <w:pStyle w:val="Question"/>
-      </w:pPr>
-      <w:r>
-        <w:t>What would prevent you or your organization from using a product like CasePilot?</w:t>
+        <w:t>If CasePilot solved one problem extremely well, what should that problem be?</w:t>
       </w:r>
     </w:p>
     <w:p>
@@ -4622,19 +1971,6 @@
     </w:p>
     <w:p>
       <w:pPr>
-        <w:keepNext/>
-        <w:numPr>
-          <w:ilvl w:val="0"/>
-          <w:numId w:val="10"/>
-        </w:numPr>
-        <w:pStyle w:val="Question"/>
-      </w:pPr>
-      <w:r>
-        <w:t>If CasePilot worked well, what result would make it valuable enough that you would not want to return to your current process?</w:t>
-      </w:r>
-    </w:p>
-    <w:p>
-      <w:pPr>
         <w:pStyle w:val="ResponseLine"/>
         <w:pBdr>
           <w:bottom w:val="single" w:sz="6" w:space="2" w:color="C9D5DF"/>
@@ -4646,53 +1982,7 @@
     </w:p>
     <w:p>
       <w:pPr>
-        <w:pStyle w:val="ResponseLine"/>
-        <w:pBdr>
-          <w:bottom w:val="single" w:sz="6" w:space="2" w:color="C9D5DF"/>
-        </w:pBdr>
-      </w:pPr>
-      <w:r>
-        <w:t xml:space="preserve"> </w:t>
-      </w:r>
-    </w:p>
-    <w:p>
-      <w:pPr>
-        <w:keepNext/>
-        <w:numPr>
-          <w:ilvl w:val="0"/>
-          <w:numId w:val="10"/>
-        </w:numPr>
-        <w:pStyle w:val="Question"/>
-      </w:pPr>
-      <w:r>
-        <w:t>What important question about your workflow did we fail to ask?</w:t>
-      </w:r>
-    </w:p>
-    <w:p>
-      <w:pPr>
-        <w:pStyle w:val="ResponseLine"/>
-        <w:pBdr>
-          <w:bottom w:val="single" w:sz="6" w:space="2" w:color="C9D5DF"/>
-        </w:pBdr>
-      </w:pPr>
-      <w:r>
-        <w:t xml:space="preserve"> </w:t>
-      </w:r>
-    </w:p>
-    <w:p>
-      <w:pPr>
-        <w:pStyle w:val="ResponseLine"/>
-        <w:pBdr>
-          <w:bottom w:val="single" w:sz="6" w:space="2" w:color="C9D5DF"/>
-        </w:pBdr>
-      </w:pPr>
-      <w:r>
-        <w:t xml:space="preserve"> </w:t>
-      </w:r>
-    </w:p>
-    <w:p>
-      <w:pPr>
-        <w:spacing w:before="320" w:after="80"/>
+        <w:spacing w:before="320"/>
         <w:jc w:val="center"/>
       </w:pPr>
       <w:r>
@@ -4700,24 +1990,9 @@
           <w:rFonts w:ascii="Calibri" w:hAnsi="Calibri" w:eastAsia="Calibri"/>
           <w:b/>
           <w:color w:val="17324D"/>
-          <w:sz w:val="26"/>
+          <w:sz w:val="25"/>
         </w:rPr>
-        <w:t>Thank you for sharing your experience.</w:t>
-      </w:r>
-    </w:p>
-    <w:p>
-      <w:pPr>
-        <w:spacing w:after="0"/>
-        <w:jc w:val="center"/>
-      </w:pPr>
-      <w:r>
-        <w:rPr>
-          <w:rFonts w:ascii="Calibri" w:hAnsi="Calibri" w:eastAsia="Calibri"/>
-          <w:i/>
-          <w:color w:val="5D6A73"/>
-          <w:sz w:val="20"/>
-        </w:rPr>
-        <w:t>Your responses will guide product validation before application development begins.</w:t>
+        <w:t>Thank you for helping us focus on the work that matters most.</w:t>
       </w:r>
     </w:p>
     <w:sectPr>
@@ -4739,9 +2014,9 @@
       <w:tabs>
         <w:tab w:pos="9360" w:val="left"/>
       </w:tabs>
-      <w:spacing w:before="40" w:after="0"/>
+      <w:spacing w:after="0"/>
       <w:pBdr>
-        <w:bottom w:val="single" w:sz="5" w:space="4" w:color="D9E1E7"/>
+        <w:top w:val="single" w:sz="5" w:space="4" w:color="D9E1E7"/>
       </w:pBdr>
     </w:pPr>
     <w:r>
@@ -4983,7 +2258,6 @@
       <w:start w:val="1"/>
       <w:numFmt w:val="decimal"/>
       <w:lvlText w:val="%1."/>
-      <w:suff w:val="tab"/>
       <w:lvlJc w:val="left"/>
       <w:pPr>
         <w:tabs>
@@ -4992,9 +2266,6 @@
         <w:ind w:left="540" w:hanging="270"/>
         <w:spacing w:after="80" w:line="300" w:lineRule="auto"/>
       </w:pPr>
-      <w:rPr>
-        <w:rFonts w:ascii="Calibri" w:hAnsi="Calibri"/>
-      </w:rPr>
     </w:lvl>
   </w:abstractNum>
   <w:num w:numId="10">
@@ -16859,13 +14130,11 @@
     <w:name w:val="Question"/>
     <w:basedOn w:val="Normal"/>
     <w:pPr>
-      <w:keepNext/>
-      <w:spacing w:before="160" w:after="80" w:line="300" w:lineRule="auto"/>
+      <w:spacing w:before="140" w:after="80" w:line="300" w:lineRule="auto"/>
     </w:pPr>
     <w:rPr>
       <w:rFonts w:ascii="Calibri" w:hAnsi="Calibri"/>
       <w:b/>
-      <w:color w:val="1F2933"/>
       <w:sz w:val="22"/>
     </w:rPr>
   </w:style>
@@ -16874,7 +14143,7 @@
     <w:basedOn w:val="Normal"/>
     <w:pPr>
       <w:spacing w:before="0" w:after="40" w:line="276" w:lineRule="auto"/>
-      <w:ind w:left="540" w:firstLine="0"/>
+      <w:ind w:left="540"/>
     </w:pPr>
     <w:rPr>
       <w:rFonts w:ascii="Calibri" w:hAnsi="Calibri"/>
@@ -16885,26 +14154,11 @@
     <w:name w:val="Response Line"/>
     <w:basedOn w:val="Normal"/>
     <w:pPr>
-      <w:spacing w:before="0" w:after="160" w:line="240" w:lineRule="auto"/>
+      <w:spacing w:after="160" w:line="240" w:lineRule="auto"/>
       <w:ind w:left="540"/>
     </w:pPr>
     <w:rPr>
-      <w:rFonts w:ascii="Calibri" w:hAnsi="Calibri"/>
       <w:sz w:val="21"/>
-    </w:rPr>
-  </w:style>
-  <w:style w:type="paragraph" w:customStyle="1" w:styleId="Instruction">
-    <w:name w:val="Instruction"/>
-    <w:basedOn w:val="Normal"/>
-    <w:pPr>
-      <w:spacing w:before="0" w:after="60"/>
-      <w:ind w:left="540"/>
-    </w:pPr>
-    <w:rPr>
-      <w:rFonts w:ascii="Calibri" w:hAnsi="Calibri"/>
-      <w:i/>
-      <w:color w:val="5D6A73"/>
-      <w:sz w:val="19"/>
     </w:rPr>
   </w:style>
 </w:styles>

</xml_diff>